<commit_message>
Knowledge - 3-Work knowledge - fix location - part 16 - 11/8/2025
</commit_message>
<xml_diff>
--- a/Knowledge/3-Work knowledge/1-Software Engineering/1-Testing/5-My Source/1-ISTQB Foundation Level/7-Test Levels, Test Types and Testing Quadrants.docx
+++ b/Knowledge/3-Work knowledge/1-Software Engineering/1-Testing/5-My Source/1-ISTQB Foundation Level/7-Test Levels, Test Types and Testing Quadrants.docx
@@ -29,21 +29,12 @@
         </w:rPr>
         <w:t xml:space="preserve">: </w:t>
       </w:r>
-      <w:proofErr w:type="spellStart"/>
-      <w:r>
-        <w:rPr>
-          <w:b/>
-          <w:shd w:val="clear" w:color="auto" w:fill="B7B7B7"/>
-        </w:rPr>
-        <w:t>Chatgpt</w:t>
-      </w:r>
-      <w:proofErr w:type="spellEnd"/>
-      <w:r>
-        <w:rPr>
-          <w:b/>
-          <w:shd w:val="clear" w:color="auto" w:fill="B7B7B7"/>
-        </w:rPr>
-        <w:t xml:space="preserve"> </w:t>
+      <w:r>
+        <w:rPr>
+          <w:b/>
+          <w:shd w:val="clear" w:color="auto" w:fill="B7B7B7"/>
+        </w:rPr>
+        <w:t xml:space="preserve">Chatgpt </w:t>
       </w:r>
       <w:r>
         <w:rPr>
@@ -52,7 +43,26 @@
           <w:szCs w:val="14"/>
           <w:shd w:val="clear" w:color="auto" w:fill="B7B7B7"/>
         </w:rPr>
-        <w:t>(GPT-5-Standard) at [8/14/2025]</w:t>
+        <w:t>(GPT</w:t>
+      </w:r>
+      <w:r>
+        <w:rPr>
+          <w:rFonts w:ascii="Cambria Math" w:hAnsi="Cambria Math" w:cs="Cambria Math"/>
+          <w:b/>
+          <w:sz w:val="14"/>
+          <w:szCs w:val="14"/>
+          <w:shd w:val="clear" w:color="auto" w:fill="B7B7B7"/>
+        </w:rPr>
+        <w:t>‑</w:t>
+      </w:r>
+      <w:r>
+        <w:rPr>
+          <w:b/>
+          <w:sz w:val="14"/>
+          <w:szCs w:val="14"/>
+          <w:shd w:val="clear" w:color="auto" w:fill="B7B7B7"/>
+        </w:rPr>
+        <w:t>5 Mini) at [8/14/2025]</w:t>
       </w:r>
     </w:p>
     <w:p>
@@ -97,7 +107,7 @@
     </w:p>
     <w:p>
       <w:r>
-        <w:pict w14:anchorId="79C730A1">
+        <w:pict w14:anchorId="5725B204">
           <v:rect id="_x0000_i1025" style="width:0;height:1.5pt" o:hralign="center" o:hrstd="t" o:hr="t" fillcolor="#a0a0a0" stroked="f"/>
         </w:pict>
       </w:r>
@@ -107,7 +117,6 @@
         <w:pStyle w:val="Heading2"/>
         <w:keepNext w:val="0"/>
         <w:keepLines w:val="0"/>
-        <w:spacing w:after="80"/>
         <w:rPr>
           <w:b/>
           <w:i/>
@@ -152,21 +161,12 @@
         </w:rPr>
         <w:t xml:space="preserve">: </w:t>
       </w:r>
-      <w:proofErr w:type="spellStart"/>
-      <w:r>
-        <w:rPr>
-          <w:b/>
-          <w:shd w:val="clear" w:color="auto" w:fill="B7B7B7"/>
-        </w:rPr>
-        <w:t>Chatgpt</w:t>
-      </w:r>
-      <w:proofErr w:type="spellEnd"/>
-      <w:r>
-        <w:rPr>
-          <w:b/>
-          <w:shd w:val="clear" w:color="auto" w:fill="B7B7B7"/>
-        </w:rPr>
-        <w:t xml:space="preserve"> </w:t>
+      <w:r>
+        <w:rPr>
+          <w:b/>
+          <w:shd w:val="clear" w:color="auto" w:fill="B7B7B7"/>
+        </w:rPr>
+        <w:t xml:space="preserve">Chatgpt </w:t>
       </w:r>
       <w:r>
         <w:rPr>
@@ -175,7 +175,26 @@
           <w:szCs w:val="14"/>
           <w:shd w:val="clear" w:color="auto" w:fill="B7B7B7"/>
         </w:rPr>
-        <w:t>(GPT-5-Standard) at [8/14/2025]</w:t>
+        <w:t>(GPT</w:t>
+      </w:r>
+      <w:r>
+        <w:rPr>
+          <w:rFonts w:ascii="Cambria Math" w:hAnsi="Cambria Math" w:cs="Cambria Math"/>
+          <w:b/>
+          <w:sz w:val="14"/>
+          <w:szCs w:val="14"/>
+          <w:shd w:val="clear" w:color="auto" w:fill="B7B7B7"/>
+        </w:rPr>
+        <w:t>‑</w:t>
+      </w:r>
+      <w:r>
+        <w:rPr>
+          <w:b/>
+          <w:sz w:val="14"/>
+          <w:szCs w:val="14"/>
+          <w:shd w:val="clear" w:color="auto" w:fill="B7B7B7"/>
+        </w:rPr>
+        <w:t>5 Mini) at [8/14/2025]</w:t>
       </w:r>
     </w:p>
     <w:p>
@@ -262,21 +281,12 @@
         </w:rPr>
         <w:t xml:space="preserve">: </w:t>
       </w:r>
-      <w:proofErr w:type="spellStart"/>
-      <w:r>
-        <w:rPr>
-          <w:b/>
-          <w:shd w:val="clear" w:color="auto" w:fill="B7B7B7"/>
-        </w:rPr>
-        <w:t>Chatgpt</w:t>
-      </w:r>
-      <w:proofErr w:type="spellEnd"/>
-      <w:r>
-        <w:rPr>
-          <w:b/>
-          <w:shd w:val="clear" w:color="auto" w:fill="B7B7B7"/>
-        </w:rPr>
-        <w:t xml:space="preserve"> </w:t>
+      <w:r>
+        <w:rPr>
+          <w:b/>
+          <w:shd w:val="clear" w:color="auto" w:fill="B7B7B7"/>
+        </w:rPr>
+        <w:t xml:space="preserve">Chatgpt </w:t>
       </w:r>
       <w:r>
         <w:rPr>
@@ -285,7 +295,26 @@
           <w:szCs w:val="14"/>
           <w:shd w:val="clear" w:color="auto" w:fill="B7B7B7"/>
         </w:rPr>
-        <w:t>(GPT-5-Standard) at [8/14/2025]</w:t>
+        <w:t>(GPT</w:t>
+      </w:r>
+      <w:r>
+        <w:rPr>
+          <w:rFonts w:ascii="Cambria Math" w:hAnsi="Cambria Math" w:cs="Cambria Math"/>
+          <w:b/>
+          <w:sz w:val="14"/>
+          <w:szCs w:val="14"/>
+          <w:shd w:val="clear" w:color="auto" w:fill="B7B7B7"/>
+        </w:rPr>
+        <w:t>‑</w:t>
+      </w:r>
+      <w:r>
+        <w:rPr>
+          <w:b/>
+          <w:sz w:val="14"/>
+          <w:szCs w:val="14"/>
+          <w:shd w:val="clear" w:color="auto" w:fill="B7B7B7"/>
+        </w:rPr>
+        <w:t>5 Mini) at [8/14/2025]</w:t>
       </w:r>
     </w:p>
     <w:p>
@@ -294,7 +323,7 @@
           <w:noProof/>
         </w:rPr>
         <w:drawing>
-          <wp:inline distT="114300" distB="114300" distL="114300" distR="114300" wp14:anchorId="69A19CAD" wp14:editId="7804935A">
+          <wp:inline distT="114300" distB="114300" distL="114300" distR="114300" wp14:anchorId="0129C389" wp14:editId="3A3F2175">
             <wp:extent cx="5943600" cy="2044700"/>
             <wp:effectExtent l="0" t="0" r="0" b="0"/>
             <wp:docPr id="4" name="image1.png"/>
@@ -332,9 +361,7 @@
     </w:p>
     <w:tbl>
       <w:tblPr>
-        <w:tblStyle w:val="a"/>
         <w:tblW w:w="9360" w:type="dxa"/>
-        <w:tblInd w:w="0" w:type="dxa"/>
         <w:tblBorders>
           <w:top w:val="nil"/>
           <w:left w:val="nil"/>
@@ -993,7 +1020,7 @@
     </w:tbl>
     <w:p>
       <w:r>
-        <w:pict w14:anchorId="6295E339">
+        <w:pict w14:anchorId="5C2B344B">
           <v:rect id="_x0000_i1026" style="width:0;height:1.5pt" o:hralign="center" o:hrstd="t" o:hr="t" fillcolor="#a0a0a0" stroked="f"/>
         </w:pict>
       </w:r>
@@ -1040,21 +1067,12 @@
         </w:rPr>
         <w:t xml:space="preserve">: </w:t>
       </w:r>
-      <w:proofErr w:type="spellStart"/>
-      <w:r>
-        <w:rPr>
-          <w:b/>
-          <w:shd w:val="clear" w:color="auto" w:fill="B7B7B7"/>
-        </w:rPr>
-        <w:t>Chatgpt</w:t>
-      </w:r>
-      <w:proofErr w:type="spellEnd"/>
-      <w:r>
-        <w:rPr>
-          <w:b/>
-          <w:shd w:val="clear" w:color="auto" w:fill="B7B7B7"/>
-        </w:rPr>
-        <w:t xml:space="preserve"> </w:t>
+      <w:r>
+        <w:rPr>
+          <w:b/>
+          <w:shd w:val="clear" w:color="auto" w:fill="B7B7B7"/>
+        </w:rPr>
+        <w:t xml:space="preserve">Chatgpt </w:t>
       </w:r>
       <w:r>
         <w:rPr>
@@ -1063,7 +1081,26 @@
           <w:szCs w:val="14"/>
           <w:shd w:val="clear" w:color="auto" w:fill="B7B7B7"/>
         </w:rPr>
-        <w:t>(GPT-5-Standard) at [8/14/2025]</w:t>
+        <w:t>(GPT</w:t>
+      </w:r>
+      <w:r>
+        <w:rPr>
+          <w:rFonts w:ascii="Cambria Math" w:hAnsi="Cambria Math" w:cs="Cambria Math"/>
+          <w:b/>
+          <w:sz w:val="14"/>
+          <w:szCs w:val="14"/>
+          <w:shd w:val="clear" w:color="auto" w:fill="B7B7B7"/>
+        </w:rPr>
+        <w:t>‑</w:t>
+      </w:r>
+      <w:r>
+        <w:rPr>
+          <w:b/>
+          <w:sz w:val="14"/>
+          <w:szCs w:val="14"/>
+          <w:shd w:val="clear" w:color="auto" w:fill="B7B7B7"/>
+        </w:rPr>
+        <w:t>5 Mini) at [8/14/2025]</w:t>
       </w:r>
     </w:p>
     <w:p>
@@ -1128,30 +1165,12 @@
         </w:rPr>
         <w:t xml:space="preserve">Example: Testing a </w:t>
       </w:r>
-      <w:proofErr w:type="spellStart"/>
-      <w:proofErr w:type="gramStart"/>
       <w:r>
         <w:rPr>
           <w:rFonts w:ascii="Roboto Mono" w:eastAsia="Roboto Mono" w:hAnsi="Roboto Mono" w:cs="Roboto Mono"/>
           <w:color w:val="188038"/>
         </w:rPr>
-        <w:t>calculateTotal</w:t>
-      </w:r>
-      <w:proofErr w:type="spellEnd"/>
-      <w:r>
-        <w:rPr>
-          <w:rFonts w:ascii="Roboto Mono" w:eastAsia="Roboto Mono" w:hAnsi="Roboto Mono" w:cs="Roboto Mono"/>
-          <w:color w:val="188038"/>
-        </w:rPr>
-        <w:t>(</w:t>
-      </w:r>
-      <w:proofErr w:type="gramEnd"/>
-      <w:r>
-        <w:rPr>
-          <w:rFonts w:ascii="Roboto Mono" w:eastAsia="Roboto Mono" w:hAnsi="Roboto Mono" w:cs="Roboto Mono"/>
-          <w:color w:val="188038"/>
-        </w:rPr>
-        <w:t>)</w:t>
+        <w:t>calculateTotal()</w:t>
       </w:r>
       <w:r>
         <w:rPr>
@@ -1180,35 +1199,7 @@
         <w:rPr>
           <w:rFonts w:ascii="Roboto Mono" w:eastAsia="Roboto Mono" w:hAnsi="Roboto Mono" w:cs="Roboto Mono"/>
         </w:rPr>
-        <w:t xml:space="preserve">Tools: JUnit, </w:t>
-      </w:r>
-      <w:proofErr w:type="spellStart"/>
-      <w:r>
-        <w:rPr>
-          <w:rFonts w:ascii="Roboto Mono" w:eastAsia="Roboto Mono" w:hAnsi="Roboto Mono" w:cs="Roboto Mono"/>
-        </w:rPr>
-        <w:t>NUnit</w:t>
-      </w:r>
-      <w:proofErr w:type="spellEnd"/>
-      <w:r>
-        <w:rPr>
-          <w:rFonts w:ascii="Roboto Mono" w:eastAsia="Roboto Mono" w:hAnsi="Roboto Mono" w:cs="Roboto Mono"/>
-        </w:rPr>
-        <w:t xml:space="preserve">, </w:t>
-      </w:r>
-      <w:proofErr w:type="spellStart"/>
-      <w:r>
-        <w:rPr>
-          <w:rFonts w:ascii="Roboto Mono" w:eastAsia="Roboto Mono" w:hAnsi="Roboto Mono" w:cs="Roboto Mono"/>
-        </w:rPr>
-        <w:t>pytest</w:t>
-      </w:r>
-      <w:proofErr w:type="spellEnd"/>
-      <w:r>
-        <w:rPr>
-          <w:rFonts w:ascii="Roboto Mono" w:eastAsia="Roboto Mono" w:hAnsi="Roboto Mono" w:cs="Roboto Mono"/>
-        </w:rPr>
-        <w:t>.</w:t>
+        <w:t>Tools: JUnit, NUnit, pytest.</w:t>
       </w:r>
       <w:r>
         <w:rPr>
@@ -1577,7 +1568,7 @@
     </w:p>
     <w:p>
       <w:r>
-        <w:pict w14:anchorId="2B3AE18B">
+        <w:pict w14:anchorId="00821038">
           <v:rect id="_x0000_i1027" style="width:0;height:1.5pt" o:hralign="center" o:hrstd="t" o:hr="t" fillcolor="#a0a0a0" stroked="f"/>
         </w:pict>
       </w:r>
@@ -1587,7 +1578,6 @@
         <w:pStyle w:val="Heading2"/>
         <w:keepNext w:val="0"/>
         <w:keepLines w:val="0"/>
-        <w:spacing w:after="80"/>
         <w:rPr>
           <w:b/>
           <w:i/>
@@ -1632,21 +1622,12 @@
         </w:rPr>
         <w:t xml:space="preserve">: </w:t>
       </w:r>
-      <w:proofErr w:type="spellStart"/>
-      <w:r>
-        <w:rPr>
-          <w:b/>
-          <w:shd w:val="clear" w:color="auto" w:fill="B7B7B7"/>
-        </w:rPr>
-        <w:t>Chatgpt</w:t>
-      </w:r>
-      <w:proofErr w:type="spellEnd"/>
-      <w:r>
-        <w:rPr>
-          <w:b/>
-          <w:shd w:val="clear" w:color="auto" w:fill="B7B7B7"/>
-        </w:rPr>
-        <w:t xml:space="preserve"> </w:t>
+      <w:r>
+        <w:rPr>
+          <w:b/>
+          <w:shd w:val="clear" w:color="auto" w:fill="B7B7B7"/>
+        </w:rPr>
+        <w:t xml:space="preserve">Chatgpt </w:t>
       </w:r>
       <w:r>
         <w:rPr>
@@ -1655,7 +1636,26 @@
           <w:szCs w:val="14"/>
           <w:shd w:val="clear" w:color="auto" w:fill="B7B7B7"/>
         </w:rPr>
-        <w:t>(GPT-5-Standard) at [8/14/2025]</w:t>
+        <w:t>(GPT</w:t>
+      </w:r>
+      <w:r>
+        <w:rPr>
+          <w:rFonts w:ascii="Cambria Math" w:hAnsi="Cambria Math" w:cs="Cambria Math"/>
+          <w:b/>
+          <w:sz w:val="14"/>
+          <w:szCs w:val="14"/>
+          <w:shd w:val="clear" w:color="auto" w:fill="B7B7B7"/>
+        </w:rPr>
+        <w:t>‑</w:t>
+      </w:r>
+      <w:r>
+        <w:rPr>
+          <w:b/>
+          <w:sz w:val="14"/>
+          <w:szCs w:val="14"/>
+          <w:shd w:val="clear" w:color="auto" w:fill="B7B7B7"/>
+        </w:rPr>
+        <w:t>5 Mini) at [8/14/2025]</w:t>
       </w:r>
     </w:p>
     <w:p>
@@ -1700,7 +1700,7 @@
     </w:p>
     <w:p>
       <w:r>
-        <w:pict w14:anchorId="0CEB5130">
+        <w:pict w14:anchorId="18B4E832">
           <v:rect id="_x0000_i1028" style="width:0;height:1.5pt" o:hralign="center" o:hrstd="t" o:hr="t" fillcolor="#a0a0a0" stroked="f"/>
         </w:pict>
       </w:r>
@@ -1747,21 +1747,12 @@
         </w:rPr>
         <w:t xml:space="preserve">: </w:t>
       </w:r>
-      <w:proofErr w:type="spellStart"/>
-      <w:r>
-        <w:rPr>
-          <w:b/>
-          <w:shd w:val="clear" w:color="auto" w:fill="B7B7B7"/>
-        </w:rPr>
-        <w:t>Chatgpt</w:t>
-      </w:r>
-      <w:proofErr w:type="spellEnd"/>
-      <w:r>
-        <w:rPr>
-          <w:b/>
-          <w:shd w:val="clear" w:color="auto" w:fill="B7B7B7"/>
-        </w:rPr>
-        <w:t xml:space="preserve"> </w:t>
+      <w:r>
+        <w:rPr>
+          <w:b/>
+          <w:shd w:val="clear" w:color="auto" w:fill="B7B7B7"/>
+        </w:rPr>
+        <w:t xml:space="preserve">Chatgpt </w:t>
       </w:r>
       <w:r>
         <w:rPr>
@@ -1770,7 +1761,26 @@
           <w:szCs w:val="14"/>
           <w:shd w:val="clear" w:color="auto" w:fill="B7B7B7"/>
         </w:rPr>
-        <w:t>(GPT-5-Standard) at [8/14/2025]</w:t>
+        <w:t>(GPT</w:t>
+      </w:r>
+      <w:r>
+        <w:rPr>
+          <w:rFonts w:ascii="Cambria Math" w:hAnsi="Cambria Math" w:cs="Cambria Math"/>
+          <w:b/>
+          <w:sz w:val="14"/>
+          <w:szCs w:val="14"/>
+          <w:shd w:val="clear" w:color="auto" w:fill="B7B7B7"/>
+        </w:rPr>
+        <w:t>‑</w:t>
+      </w:r>
+      <w:r>
+        <w:rPr>
+          <w:b/>
+          <w:sz w:val="14"/>
+          <w:szCs w:val="14"/>
+          <w:shd w:val="clear" w:color="auto" w:fill="B7B7B7"/>
+        </w:rPr>
+        <w:t>5 Mini) at [8/14/2025]</w:t>
       </w:r>
     </w:p>
     <w:p>
@@ -1780,7 +1790,7 @@
         </w:rPr>
         <w:lastRenderedPageBreak/>
         <w:drawing>
-          <wp:inline distT="114300" distB="114300" distL="114300" distR="114300" wp14:anchorId="3A96610D" wp14:editId="3615F58F">
+          <wp:inline distT="114300" distB="114300" distL="114300" distR="114300" wp14:anchorId="22F3524F" wp14:editId="6BA9669B">
             <wp:extent cx="5943600" cy="1879600"/>
             <wp:effectExtent l="0" t="0" r="0" b="0"/>
             <wp:docPr id="3" name="image3.png"/>
@@ -1818,9 +1828,7 @@
     </w:p>
     <w:tbl>
       <w:tblPr>
-        <w:tblStyle w:val="a0"/>
         <w:tblW w:w="9360" w:type="dxa"/>
-        <w:tblInd w:w="0" w:type="dxa"/>
         <w:tblBorders>
           <w:top w:val="nil"/>
           <w:left w:val="nil"/>
@@ -2338,7 +2346,7 @@
     </w:tbl>
     <w:p>
       <w:r>
-        <w:pict w14:anchorId="037A2D85">
+        <w:pict w14:anchorId="6F3C9450">
           <v:rect id="_x0000_i1029" style="width:0;height:1.5pt" o:hralign="center" o:hrstd="t" o:hr="t" fillcolor="#a0a0a0" stroked="f"/>
         </w:pict>
       </w:r>
@@ -2385,21 +2393,12 @@
         </w:rPr>
         <w:t xml:space="preserve">: </w:t>
       </w:r>
-      <w:proofErr w:type="spellStart"/>
-      <w:r>
-        <w:rPr>
-          <w:b/>
-          <w:shd w:val="clear" w:color="auto" w:fill="B7B7B7"/>
-        </w:rPr>
-        <w:t>Chatgpt</w:t>
-      </w:r>
-      <w:proofErr w:type="spellEnd"/>
-      <w:r>
-        <w:rPr>
-          <w:b/>
-          <w:shd w:val="clear" w:color="auto" w:fill="B7B7B7"/>
-        </w:rPr>
-        <w:t xml:space="preserve"> </w:t>
+      <w:r>
+        <w:rPr>
+          <w:b/>
+          <w:shd w:val="clear" w:color="auto" w:fill="B7B7B7"/>
+        </w:rPr>
+        <w:t xml:space="preserve">Chatgpt </w:t>
       </w:r>
       <w:r>
         <w:rPr>
@@ -2408,7 +2407,26 @@
           <w:szCs w:val="14"/>
           <w:shd w:val="clear" w:color="auto" w:fill="B7B7B7"/>
         </w:rPr>
-        <w:t>(GPT-5-Standard) at [8/14/2025]</w:t>
+        <w:t>(GPT</w:t>
+      </w:r>
+      <w:r>
+        <w:rPr>
+          <w:rFonts w:ascii="Cambria Math" w:hAnsi="Cambria Math" w:cs="Cambria Math"/>
+          <w:b/>
+          <w:sz w:val="14"/>
+          <w:szCs w:val="14"/>
+          <w:shd w:val="clear" w:color="auto" w:fill="B7B7B7"/>
+        </w:rPr>
+        <w:t>‑</w:t>
+      </w:r>
+      <w:r>
+        <w:rPr>
+          <w:b/>
+          <w:sz w:val="14"/>
+          <w:szCs w:val="14"/>
+          <w:shd w:val="clear" w:color="auto" w:fill="B7B7B7"/>
+        </w:rPr>
+        <w:t>5 Mini) at [8/14/2025]</w:t>
       </w:r>
     </w:p>
     <w:p>
@@ -2909,7 +2927,7 @@
     </w:p>
     <w:p>
       <w:r>
-        <w:pict w14:anchorId="0130EE22">
+        <w:pict w14:anchorId="0212B7B7">
           <v:rect id="_x0000_i1030" style="width:0;height:1.5pt" o:hralign="center" o:hrstd="t" o:hr="t" fillcolor="#a0a0a0" stroked="f"/>
         </w:pict>
       </w:r>
@@ -2923,7 +2941,6 @@
       <w:bookmarkStart w:id="7" w:name="_szbum6kt5m79" w:colFirst="0" w:colLast="0"/>
       <w:bookmarkEnd w:id="7"/>
       <w:r>
-        <w:lastRenderedPageBreak/>
         <w:t>How Test Levels and Test Types Work Together</w:t>
       </w:r>
     </w:p>
@@ -2944,21 +2961,12 @@
         </w:rPr>
         <w:t xml:space="preserve">: </w:t>
       </w:r>
-      <w:proofErr w:type="spellStart"/>
-      <w:r>
-        <w:rPr>
-          <w:b/>
-          <w:shd w:val="clear" w:color="auto" w:fill="B7B7B7"/>
-        </w:rPr>
-        <w:t>Chatgpt</w:t>
-      </w:r>
-      <w:proofErr w:type="spellEnd"/>
-      <w:r>
-        <w:rPr>
-          <w:b/>
-          <w:shd w:val="clear" w:color="auto" w:fill="B7B7B7"/>
-        </w:rPr>
-        <w:t xml:space="preserve"> </w:t>
+      <w:r>
+        <w:rPr>
+          <w:b/>
+          <w:shd w:val="clear" w:color="auto" w:fill="B7B7B7"/>
+        </w:rPr>
+        <w:t xml:space="preserve">Chatgpt </w:t>
       </w:r>
       <w:r>
         <w:rPr>
@@ -2967,7 +2975,26 @@
           <w:szCs w:val="14"/>
           <w:shd w:val="clear" w:color="auto" w:fill="B7B7B7"/>
         </w:rPr>
-        <w:t>(GPT-5-Standard) at [8/14/2025]</w:t>
+        <w:t>(GPT</w:t>
+      </w:r>
+      <w:r>
+        <w:rPr>
+          <w:rFonts w:ascii="Cambria Math" w:hAnsi="Cambria Math" w:cs="Cambria Math"/>
+          <w:b/>
+          <w:sz w:val="14"/>
+          <w:szCs w:val="14"/>
+          <w:shd w:val="clear" w:color="auto" w:fill="B7B7B7"/>
+        </w:rPr>
+        <w:t>‑</w:t>
+      </w:r>
+      <w:r>
+        <w:rPr>
+          <w:b/>
+          <w:sz w:val="14"/>
+          <w:szCs w:val="14"/>
+          <w:shd w:val="clear" w:color="auto" w:fill="B7B7B7"/>
+        </w:rPr>
+        <w:t>5 Mini) at [8/14/2025]</w:t>
       </w:r>
     </w:p>
     <w:p>
@@ -2983,6 +3010,7 @@
           <w:rFonts w:ascii="Roboto Mono" w:eastAsia="Roboto Mono" w:hAnsi="Roboto Mono" w:cs="Roboto Mono"/>
           <w:b/>
         </w:rPr>
+        <w:lastRenderedPageBreak/>
         <w:t>Test levels</w:t>
       </w:r>
       <w:r>
@@ -3122,7 +3150,7 @@
     </w:p>
     <w:p>
       <w:r>
-        <w:pict w14:anchorId="4D2C4546">
+        <w:pict w14:anchorId="231E9FE7">
           <v:rect id="_x0000_i1031" style="width:0;height:1.5pt" o:hralign="center" o:hrstd="t" o:hr="t" fillcolor="#a0a0a0" stroked="f"/>
         </w:pict>
       </w:r>
@@ -3167,21 +3195,12 @@
         </w:rPr>
         <w:t xml:space="preserve">: </w:t>
       </w:r>
-      <w:proofErr w:type="spellStart"/>
-      <w:r>
-        <w:rPr>
-          <w:b/>
-          <w:shd w:val="clear" w:color="auto" w:fill="B7B7B7"/>
-        </w:rPr>
-        <w:t>Chatgot</w:t>
-      </w:r>
-      <w:proofErr w:type="spellEnd"/>
-      <w:r>
-        <w:rPr>
-          <w:b/>
-          <w:shd w:val="clear" w:color="auto" w:fill="B7B7B7"/>
-        </w:rPr>
-        <w:t xml:space="preserve"> </w:t>
+      <w:r>
+        <w:rPr>
+          <w:b/>
+          <w:shd w:val="clear" w:color="auto" w:fill="B7B7B7"/>
+        </w:rPr>
+        <w:t xml:space="preserve">Chatgot </w:t>
       </w:r>
       <w:r>
         <w:rPr>
@@ -3190,7 +3209,26 @@
           <w:szCs w:val="14"/>
           <w:shd w:val="clear" w:color="auto" w:fill="B7B7B7"/>
         </w:rPr>
-        <w:t>(GPT-5-Standard) at [8/18/2025]</w:t>
+        <w:t>(GPT</w:t>
+      </w:r>
+      <w:r>
+        <w:rPr>
+          <w:rFonts w:ascii="Cambria Math" w:hAnsi="Cambria Math" w:cs="Cambria Math"/>
+          <w:b/>
+          <w:sz w:val="14"/>
+          <w:szCs w:val="14"/>
+          <w:shd w:val="clear" w:color="auto" w:fill="B7B7B7"/>
+        </w:rPr>
+        <w:t>‑</w:t>
+      </w:r>
+      <w:r>
+        <w:rPr>
+          <w:b/>
+          <w:sz w:val="14"/>
+          <w:szCs w:val="14"/>
+          <w:shd w:val="clear" w:color="auto" w:fill="B7B7B7"/>
+        </w:rPr>
+        <w:t>5 Mini) at [8/18/2025]</w:t>
       </w:r>
     </w:p>
     <w:p>
@@ -3427,7 +3465,7 @@
     </w:p>
     <w:p>
       <w:r>
-        <w:pict w14:anchorId="366A6DBE">
+        <w:pict w14:anchorId="68E93224">
           <v:rect id="_x0000_i1032" style="width:0;height:1.5pt" o:hralign="center" o:hrstd="t" o:hr="t" fillcolor="#a0a0a0" stroked="f"/>
         </w:pict>
       </w:r>
@@ -3442,7 +3480,6 @@
       <w:bookmarkStart w:id="10" w:name="_xcrtxm9y5291" w:colFirst="0" w:colLast="0"/>
       <w:bookmarkEnd w:id="10"/>
       <w:r>
-        <w:lastRenderedPageBreak/>
         <w:t>🔹 The Four Quadrants</w:t>
       </w:r>
     </w:p>
@@ -3475,21 +3512,12 @@
         </w:rPr>
         <w:t xml:space="preserve">: </w:t>
       </w:r>
-      <w:proofErr w:type="spellStart"/>
-      <w:r>
-        <w:rPr>
-          <w:b/>
-          <w:shd w:val="clear" w:color="auto" w:fill="B7B7B7"/>
-        </w:rPr>
-        <w:t>Chatgot</w:t>
-      </w:r>
-      <w:proofErr w:type="spellEnd"/>
-      <w:r>
-        <w:rPr>
-          <w:b/>
-          <w:shd w:val="clear" w:color="auto" w:fill="B7B7B7"/>
-        </w:rPr>
-        <w:t xml:space="preserve"> </w:t>
+      <w:r>
+        <w:rPr>
+          <w:b/>
+          <w:shd w:val="clear" w:color="auto" w:fill="B7B7B7"/>
+        </w:rPr>
+        <w:t xml:space="preserve">Chatgot </w:t>
       </w:r>
       <w:r>
         <w:rPr>
@@ -3498,7 +3526,26 @@
           <w:szCs w:val="14"/>
           <w:shd w:val="clear" w:color="auto" w:fill="B7B7B7"/>
         </w:rPr>
-        <w:t>(GPT-5-Standard) at [8/18/2025]</w:t>
+        <w:t>(GPT</w:t>
+      </w:r>
+      <w:r>
+        <w:rPr>
+          <w:rFonts w:ascii="Cambria Math" w:hAnsi="Cambria Math" w:cs="Cambria Math"/>
+          <w:b/>
+          <w:sz w:val="14"/>
+          <w:szCs w:val="14"/>
+          <w:shd w:val="clear" w:color="auto" w:fill="B7B7B7"/>
+        </w:rPr>
+        <w:t>‑</w:t>
+      </w:r>
+      <w:r>
+        <w:rPr>
+          <w:b/>
+          <w:sz w:val="14"/>
+          <w:szCs w:val="14"/>
+          <w:shd w:val="clear" w:color="auto" w:fill="B7B7B7"/>
+        </w:rPr>
+        <w:t>5 Mini) at [8/18/2025]</w:t>
       </w:r>
     </w:p>
     <w:p>
@@ -3514,6 +3561,7 @@
           <w:rFonts w:ascii="Roboto Mono" w:eastAsia="Roboto Mono" w:hAnsi="Roboto Mono" w:cs="Roboto Mono"/>
           <w:b/>
         </w:rPr>
+        <w:lastRenderedPageBreak/>
         <w:t>Goal:</w:t>
       </w:r>
       <w:r>
@@ -3602,35 +3650,7 @@
         <w:rPr>
           <w:rFonts w:ascii="Roboto Mono" w:eastAsia="Roboto Mono" w:hAnsi="Roboto Mono" w:cs="Roboto Mono"/>
         </w:rPr>
-        <w:t xml:space="preserve"> JUnit, </w:t>
-      </w:r>
-      <w:proofErr w:type="spellStart"/>
-      <w:r>
-        <w:rPr>
-          <w:rFonts w:ascii="Roboto Mono" w:eastAsia="Roboto Mono" w:hAnsi="Roboto Mono" w:cs="Roboto Mono"/>
-        </w:rPr>
-        <w:t>pytest</w:t>
-      </w:r>
-      <w:proofErr w:type="spellEnd"/>
-      <w:r>
-        <w:rPr>
-          <w:rFonts w:ascii="Roboto Mono" w:eastAsia="Roboto Mono" w:hAnsi="Roboto Mono" w:cs="Roboto Mono"/>
-        </w:rPr>
-        <w:t xml:space="preserve">, </w:t>
-      </w:r>
-      <w:proofErr w:type="spellStart"/>
-      <w:r>
-        <w:rPr>
-          <w:rFonts w:ascii="Roboto Mono" w:eastAsia="Roboto Mono" w:hAnsi="Roboto Mono" w:cs="Roboto Mono"/>
-        </w:rPr>
-        <w:t>NUnit</w:t>
-      </w:r>
-      <w:proofErr w:type="spellEnd"/>
-      <w:r>
-        <w:rPr>
-          <w:rFonts w:ascii="Roboto Mono" w:eastAsia="Roboto Mono" w:hAnsi="Roboto Mono" w:cs="Roboto Mono"/>
-        </w:rPr>
-        <w:t>, TestNG.</w:t>
+        <w:t xml:space="preserve"> JUnit, pytest, NUnit, TestNG.</w:t>
       </w:r>
       <w:r>
         <w:rPr>
@@ -3641,7 +3661,7 @@
     </w:p>
     <w:p>
       <w:r>
-        <w:pict w14:anchorId="2C00D2C3">
+        <w:pict w14:anchorId="55357C06">
           <v:rect id="_x0000_i1033" style="width:0;height:1.5pt" o:hralign="center" o:hrstd="t" o:hr="t" fillcolor="#a0a0a0" stroked="f"/>
         </w:pict>
       </w:r>
@@ -3675,21 +3695,12 @@
         </w:rPr>
         <w:t xml:space="preserve">: </w:t>
       </w:r>
-      <w:proofErr w:type="spellStart"/>
-      <w:r>
-        <w:rPr>
-          <w:b/>
-          <w:shd w:val="clear" w:color="auto" w:fill="B7B7B7"/>
-        </w:rPr>
-        <w:t>Chatgot</w:t>
-      </w:r>
-      <w:proofErr w:type="spellEnd"/>
-      <w:r>
-        <w:rPr>
-          <w:b/>
-          <w:shd w:val="clear" w:color="auto" w:fill="B7B7B7"/>
-        </w:rPr>
-        <w:t xml:space="preserve"> </w:t>
+      <w:r>
+        <w:rPr>
+          <w:b/>
+          <w:shd w:val="clear" w:color="auto" w:fill="B7B7B7"/>
+        </w:rPr>
+        <w:t xml:space="preserve">Chatgot </w:t>
       </w:r>
       <w:r>
         <w:rPr>
@@ -3698,7 +3709,26 @@
           <w:szCs w:val="14"/>
           <w:shd w:val="clear" w:color="auto" w:fill="B7B7B7"/>
         </w:rPr>
-        <w:t>(GPT-5-Standard) at [8/18/2025]</w:t>
+        <w:t>(GPT</w:t>
+      </w:r>
+      <w:r>
+        <w:rPr>
+          <w:rFonts w:ascii="Cambria Math" w:hAnsi="Cambria Math" w:cs="Cambria Math"/>
+          <w:b/>
+          <w:sz w:val="14"/>
+          <w:szCs w:val="14"/>
+          <w:shd w:val="clear" w:color="auto" w:fill="B7B7B7"/>
+        </w:rPr>
+        <w:t>‑</w:t>
+      </w:r>
+      <w:r>
+        <w:rPr>
+          <w:b/>
+          <w:sz w:val="14"/>
+          <w:szCs w:val="14"/>
+          <w:shd w:val="clear" w:color="auto" w:fill="B7B7B7"/>
+        </w:rPr>
+        <w:t>5 Mini) at [8/18/2025]</w:t>
       </w:r>
     </w:p>
     <w:p>
@@ -3815,35 +3845,7 @@
         <w:rPr>
           <w:rFonts w:ascii="Roboto Mono" w:eastAsia="Roboto Mono" w:hAnsi="Roboto Mono" w:cs="Roboto Mono"/>
         </w:rPr>
-        <w:t xml:space="preserve"> Cucumber, </w:t>
-      </w:r>
-      <w:proofErr w:type="spellStart"/>
-      <w:r>
-        <w:rPr>
-          <w:rFonts w:ascii="Roboto Mono" w:eastAsia="Roboto Mono" w:hAnsi="Roboto Mono" w:cs="Roboto Mono"/>
-        </w:rPr>
-        <w:t>FitNesse</w:t>
-      </w:r>
-      <w:proofErr w:type="spellEnd"/>
-      <w:r>
-        <w:rPr>
-          <w:rFonts w:ascii="Roboto Mono" w:eastAsia="Roboto Mono" w:hAnsi="Roboto Mono" w:cs="Roboto Mono"/>
-        </w:rPr>
-        <w:t xml:space="preserve">, </w:t>
-      </w:r>
-      <w:proofErr w:type="spellStart"/>
-      <w:r>
-        <w:rPr>
-          <w:rFonts w:ascii="Roboto Mono" w:eastAsia="Roboto Mono" w:hAnsi="Roboto Mono" w:cs="Roboto Mono"/>
-        </w:rPr>
-        <w:t>SpecFlow</w:t>
-      </w:r>
-      <w:proofErr w:type="spellEnd"/>
-      <w:r>
-        <w:rPr>
-          <w:rFonts w:ascii="Roboto Mono" w:eastAsia="Roboto Mono" w:hAnsi="Roboto Mono" w:cs="Roboto Mono"/>
-        </w:rPr>
-        <w:t>.</w:t>
+        <w:t xml:space="preserve"> Cucumber, FitNesse, SpecFlow.</w:t>
       </w:r>
       <w:r>
         <w:rPr>
@@ -3854,7 +3856,7 @@
     </w:p>
     <w:p>
       <w:r>
-        <w:pict w14:anchorId="36A25A48">
+        <w:pict w14:anchorId="7FE3D010">
           <v:rect id="_x0000_i1034" style="width:0;height:1.5pt" o:hralign="center" o:hrstd="t" o:hr="t" fillcolor="#a0a0a0" stroked="f"/>
         </w:pict>
       </w:r>
@@ -3888,21 +3890,12 @@
         </w:rPr>
         <w:t xml:space="preserve">: </w:t>
       </w:r>
-      <w:proofErr w:type="spellStart"/>
-      <w:r>
-        <w:rPr>
-          <w:b/>
-          <w:shd w:val="clear" w:color="auto" w:fill="B7B7B7"/>
-        </w:rPr>
-        <w:t>Chatgot</w:t>
-      </w:r>
-      <w:proofErr w:type="spellEnd"/>
-      <w:r>
-        <w:rPr>
-          <w:b/>
-          <w:shd w:val="clear" w:color="auto" w:fill="B7B7B7"/>
-        </w:rPr>
-        <w:t xml:space="preserve"> </w:t>
+      <w:r>
+        <w:rPr>
+          <w:b/>
+          <w:shd w:val="clear" w:color="auto" w:fill="B7B7B7"/>
+        </w:rPr>
+        <w:t xml:space="preserve">Chatgot </w:t>
       </w:r>
       <w:r>
         <w:rPr>
@@ -3911,7 +3904,26 @@
           <w:szCs w:val="14"/>
           <w:shd w:val="clear" w:color="auto" w:fill="B7B7B7"/>
         </w:rPr>
-        <w:t>(GPT-5-Standard) at [8/18/2025]</w:t>
+        <w:t>(GPT</w:t>
+      </w:r>
+      <w:r>
+        <w:rPr>
+          <w:rFonts w:ascii="Cambria Math" w:hAnsi="Cambria Math" w:cs="Cambria Math"/>
+          <w:b/>
+          <w:sz w:val="14"/>
+          <w:szCs w:val="14"/>
+          <w:shd w:val="clear" w:color="auto" w:fill="B7B7B7"/>
+        </w:rPr>
+        <w:t>‑</w:t>
+      </w:r>
+      <w:r>
+        <w:rPr>
+          <w:b/>
+          <w:sz w:val="14"/>
+          <w:szCs w:val="14"/>
+          <w:shd w:val="clear" w:color="auto" w:fill="B7B7B7"/>
+        </w:rPr>
+        <w:t>5 Mini) at [8/18/2025]</w:t>
       </w:r>
     </w:p>
     <w:p>
@@ -3981,7 +3993,6 @@
           <w:rFonts w:ascii="Roboto Mono" w:eastAsia="Roboto Mono" w:hAnsi="Roboto Mono" w:cs="Roboto Mono"/>
           <w:b/>
         </w:rPr>
-        <w:lastRenderedPageBreak/>
         <w:t>Who:</w:t>
       </w:r>
       <w:r>
@@ -4024,7 +4035,7 @@
     </w:p>
     <w:p>
       <w:r>
-        <w:pict w14:anchorId="0D6E5506">
+        <w:pict w14:anchorId="61B1E681">
           <v:rect id="_x0000_i1035" style="width:0;height:1.5pt" o:hralign="center" o:hrstd="t" o:hr="t" fillcolor="#a0a0a0" stroked="f"/>
         </w:pict>
       </w:r>
@@ -4050,6 +4061,7 @@
           <w:b/>
           <w:shd w:val="clear" w:color="auto" w:fill="B7B7B7"/>
         </w:rPr>
+        <w:lastRenderedPageBreak/>
         <w:t># Source</w:t>
       </w:r>
       <w:r>
@@ -4058,21 +4070,12 @@
         </w:rPr>
         <w:t xml:space="preserve">: </w:t>
       </w:r>
-      <w:proofErr w:type="spellStart"/>
-      <w:r>
-        <w:rPr>
-          <w:b/>
-          <w:shd w:val="clear" w:color="auto" w:fill="B7B7B7"/>
-        </w:rPr>
-        <w:t>Chatgot</w:t>
-      </w:r>
-      <w:proofErr w:type="spellEnd"/>
-      <w:r>
-        <w:rPr>
-          <w:b/>
-          <w:shd w:val="clear" w:color="auto" w:fill="B7B7B7"/>
-        </w:rPr>
-        <w:t xml:space="preserve"> </w:t>
+      <w:r>
+        <w:rPr>
+          <w:b/>
+          <w:shd w:val="clear" w:color="auto" w:fill="B7B7B7"/>
+        </w:rPr>
+        <w:t xml:space="preserve">Chatgot </w:t>
       </w:r>
       <w:r>
         <w:rPr>
@@ -4081,7 +4084,26 @@
           <w:szCs w:val="14"/>
           <w:shd w:val="clear" w:color="auto" w:fill="B7B7B7"/>
         </w:rPr>
-        <w:t>(GPT-5-Standard) at [8/18/2025]</w:t>
+        <w:t>(GPT</w:t>
+      </w:r>
+      <w:r>
+        <w:rPr>
+          <w:rFonts w:ascii="Cambria Math" w:hAnsi="Cambria Math" w:cs="Cambria Math"/>
+          <w:b/>
+          <w:sz w:val="14"/>
+          <w:szCs w:val="14"/>
+          <w:shd w:val="clear" w:color="auto" w:fill="B7B7B7"/>
+        </w:rPr>
+        <w:t>‑</w:t>
+      </w:r>
+      <w:r>
+        <w:rPr>
+          <w:b/>
+          <w:sz w:val="14"/>
+          <w:szCs w:val="14"/>
+          <w:shd w:val="clear" w:color="auto" w:fill="B7B7B7"/>
+        </w:rPr>
+        <w:t>5 Mini) at [8/18/2025]</w:t>
       </w:r>
     </w:p>
     <w:p>
@@ -4209,7 +4231,7 @@
     </w:p>
     <w:p>
       <w:r>
-        <w:pict w14:anchorId="5CC08AFD">
+        <w:pict w14:anchorId="00E4C3E6">
           <v:rect id="_x0000_i1036" style="width:0;height:1.5pt" o:hralign="center" o:hrstd="t" o:hr="t" fillcolor="#a0a0a0" stroked="f"/>
         </w:pict>
       </w:r>
@@ -4244,21 +4266,12 @@
         </w:rPr>
         <w:t xml:space="preserve">: </w:t>
       </w:r>
-      <w:proofErr w:type="spellStart"/>
-      <w:r>
-        <w:rPr>
-          <w:b/>
-          <w:shd w:val="clear" w:color="auto" w:fill="B7B7B7"/>
-        </w:rPr>
-        <w:t>Chatgot</w:t>
-      </w:r>
-      <w:proofErr w:type="spellEnd"/>
-      <w:r>
-        <w:rPr>
-          <w:b/>
-          <w:shd w:val="clear" w:color="auto" w:fill="B7B7B7"/>
-        </w:rPr>
-        <w:t xml:space="preserve"> </w:t>
+      <w:r>
+        <w:rPr>
+          <w:b/>
+          <w:shd w:val="clear" w:color="auto" w:fill="B7B7B7"/>
+        </w:rPr>
+        <w:t xml:space="preserve">Chatgot </w:t>
       </w:r>
       <w:r>
         <w:rPr>
@@ -4267,7 +4280,26 @@
           <w:szCs w:val="14"/>
           <w:shd w:val="clear" w:color="auto" w:fill="B7B7B7"/>
         </w:rPr>
-        <w:t>(GPT-5-Standard) at [8/24/2025]</w:t>
+        <w:t>(GPT</w:t>
+      </w:r>
+      <w:r>
+        <w:rPr>
+          <w:rFonts w:ascii="Cambria Math" w:hAnsi="Cambria Math" w:cs="Cambria Math"/>
+          <w:b/>
+          <w:sz w:val="14"/>
+          <w:szCs w:val="14"/>
+          <w:shd w:val="clear" w:color="auto" w:fill="B7B7B7"/>
+        </w:rPr>
+        <w:t>‑</w:t>
+      </w:r>
+      <w:r>
+        <w:rPr>
+          <w:b/>
+          <w:sz w:val="14"/>
+          <w:szCs w:val="14"/>
+          <w:shd w:val="clear" w:color="auto" w:fill="B7B7B7"/>
+        </w:rPr>
+        <w:t>5 Mini) at [8/24/2025]</w:t>
       </w:r>
     </w:p>
     <w:p>
@@ -4341,7 +4373,7 @@
         <w:spacing w:before="480"/>
       </w:pPr>
       <w:r>
-        <w:pict w14:anchorId="61A0F482">
+        <w:pict w14:anchorId="633C0AA5">
           <v:rect id="_x0000_i1037" style="width:0;height:1.5pt" o:hralign="center" o:hrstd="t" o:hr="t" fillcolor="#a0a0a0" stroked="f"/>
         </w:pict>
       </w:r>
@@ -4378,21 +4410,12 @@
         </w:rPr>
         <w:t xml:space="preserve">: </w:t>
       </w:r>
-      <w:proofErr w:type="spellStart"/>
-      <w:r>
-        <w:rPr>
-          <w:b/>
-          <w:shd w:val="clear" w:color="auto" w:fill="B7B7B7"/>
-        </w:rPr>
-        <w:t>Chatgot</w:t>
-      </w:r>
-      <w:proofErr w:type="spellEnd"/>
-      <w:r>
-        <w:rPr>
-          <w:b/>
-          <w:shd w:val="clear" w:color="auto" w:fill="B7B7B7"/>
-        </w:rPr>
-        <w:t xml:space="preserve"> </w:t>
+      <w:r>
+        <w:rPr>
+          <w:b/>
+          <w:shd w:val="clear" w:color="auto" w:fill="B7B7B7"/>
+        </w:rPr>
+        <w:t xml:space="preserve">Chatgot </w:t>
       </w:r>
       <w:r>
         <w:rPr>
@@ -4401,7 +4424,26 @@
           <w:szCs w:val="14"/>
           <w:shd w:val="clear" w:color="auto" w:fill="B7B7B7"/>
         </w:rPr>
-        <w:t>(GPT-5-Standard) at [8/24/2025]</w:t>
+        <w:t>(GPT</w:t>
+      </w:r>
+      <w:r>
+        <w:rPr>
+          <w:rFonts w:ascii="Cambria Math" w:hAnsi="Cambria Math" w:cs="Cambria Math"/>
+          <w:b/>
+          <w:sz w:val="14"/>
+          <w:szCs w:val="14"/>
+          <w:shd w:val="clear" w:color="auto" w:fill="B7B7B7"/>
+        </w:rPr>
+        <w:t>‑</w:t>
+      </w:r>
+      <w:r>
+        <w:rPr>
+          <w:b/>
+          <w:sz w:val="14"/>
+          <w:szCs w:val="14"/>
+          <w:shd w:val="clear" w:color="auto" w:fill="B7B7B7"/>
+        </w:rPr>
+        <w:t>5 Mini) at [8/24/2025]</w:t>
       </w:r>
     </w:p>
     <w:p>
@@ -4456,7 +4498,6 @@
         <w:rPr>
           <w:rFonts w:ascii="Roboto Mono" w:eastAsia="Roboto Mono" w:hAnsi="Roboto Mono" w:cs="Roboto Mono"/>
         </w:rPr>
-        <w:lastRenderedPageBreak/>
         <w:t xml:space="preserve">Quadrants (Q1–Q4) focus on </w:t>
       </w:r>
       <w:r>
@@ -4601,7 +4642,8 @@
         <w:spacing w:before="480"/>
       </w:pPr>
       <w:r>
-        <w:pict w14:anchorId="76D10EF1">
+        <w:lastRenderedPageBreak/>
+        <w:pict w14:anchorId="11714FB6">
           <v:rect id="_x0000_i1038" style="width:0;height:1.5pt" o:hralign="center" o:hrstd="t" o:hr="t" fillcolor="#a0a0a0" stroked="f"/>
         </w:pict>
       </w:r>
@@ -4638,21 +4680,12 @@
         </w:rPr>
         <w:t xml:space="preserve">: </w:t>
       </w:r>
-      <w:proofErr w:type="spellStart"/>
-      <w:r>
-        <w:rPr>
-          <w:b/>
-          <w:shd w:val="clear" w:color="auto" w:fill="B7B7B7"/>
-        </w:rPr>
-        <w:t>Chatgot</w:t>
-      </w:r>
-      <w:proofErr w:type="spellEnd"/>
-      <w:r>
-        <w:rPr>
-          <w:b/>
-          <w:shd w:val="clear" w:color="auto" w:fill="B7B7B7"/>
-        </w:rPr>
-        <w:t xml:space="preserve"> </w:t>
+      <w:r>
+        <w:rPr>
+          <w:b/>
+          <w:shd w:val="clear" w:color="auto" w:fill="B7B7B7"/>
+        </w:rPr>
+        <w:t xml:space="preserve">Chatgot </w:t>
       </w:r>
       <w:r>
         <w:rPr>
@@ -4661,7 +4694,26 @@
           <w:szCs w:val="14"/>
           <w:shd w:val="clear" w:color="auto" w:fill="B7B7B7"/>
         </w:rPr>
-        <w:t>(GPT-5-Standard) at [8/24/2025]</w:t>
+        <w:t>(GPT</w:t>
+      </w:r>
+      <w:r>
+        <w:rPr>
+          <w:rFonts w:ascii="Cambria Math" w:hAnsi="Cambria Math" w:cs="Cambria Math"/>
+          <w:b/>
+          <w:sz w:val="14"/>
+          <w:szCs w:val="14"/>
+          <w:shd w:val="clear" w:color="auto" w:fill="B7B7B7"/>
+        </w:rPr>
+        <w:t>‑</w:t>
+      </w:r>
+      <w:r>
+        <w:rPr>
+          <w:b/>
+          <w:sz w:val="14"/>
+          <w:szCs w:val="14"/>
+          <w:shd w:val="clear" w:color="auto" w:fill="B7B7B7"/>
+        </w:rPr>
+        <w:t>5 Mini) at [8/24/2025]</w:t>
       </w:r>
     </w:p>
     <w:p>
@@ -4919,7 +4971,6 @@
       <w:bookmarkStart w:id="18" w:name="_rxn7z0mj2kfa" w:colFirst="0" w:colLast="0"/>
       <w:bookmarkEnd w:id="18"/>
       <w:r>
-        <w:lastRenderedPageBreak/>
         <w:t>visual diagram showing Test Levels, Test Types, and Testing Quadrants</w:t>
       </w:r>
     </w:p>
@@ -4946,21 +4997,12 @@
         </w:rPr>
         <w:t xml:space="preserve">: </w:t>
       </w:r>
-      <w:proofErr w:type="spellStart"/>
-      <w:r>
-        <w:rPr>
-          <w:b/>
-          <w:shd w:val="clear" w:color="auto" w:fill="B7B7B7"/>
-        </w:rPr>
-        <w:t>Chatgot</w:t>
-      </w:r>
-      <w:proofErr w:type="spellEnd"/>
-      <w:r>
-        <w:rPr>
-          <w:b/>
-          <w:shd w:val="clear" w:color="auto" w:fill="B7B7B7"/>
-        </w:rPr>
-        <w:t xml:space="preserve"> </w:t>
+      <w:r>
+        <w:rPr>
+          <w:b/>
+          <w:shd w:val="clear" w:color="auto" w:fill="B7B7B7"/>
+        </w:rPr>
+        <w:t xml:space="preserve">Chatgot </w:t>
       </w:r>
       <w:r>
         <w:rPr>
@@ -4969,7 +5011,26 @@
           <w:szCs w:val="14"/>
           <w:shd w:val="clear" w:color="auto" w:fill="B7B7B7"/>
         </w:rPr>
-        <w:t>(GPT-5-Standard) at [8/24/2025]</w:t>
+        <w:t>(GPT</w:t>
+      </w:r>
+      <w:r>
+        <w:rPr>
+          <w:rFonts w:ascii="Cambria Math" w:hAnsi="Cambria Math" w:cs="Cambria Math"/>
+          <w:b/>
+          <w:sz w:val="14"/>
+          <w:szCs w:val="14"/>
+          <w:shd w:val="clear" w:color="auto" w:fill="B7B7B7"/>
+        </w:rPr>
+        <w:t>‑</w:t>
+      </w:r>
+      <w:r>
+        <w:rPr>
+          <w:b/>
+          <w:sz w:val="14"/>
+          <w:szCs w:val="14"/>
+          <w:shd w:val="clear" w:color="auto" w:fill="B7B7B7"/>
+        </w:rPr>
+        <w:t>5 Mini) at [8/24/2025]</w:t>
       </w:r>
     </w:p>
     <w:p>
@@ -4985,8 +5046,9 @@
         <w:rPr>
           <w:noProof/>
         </w:rPr>
+        <w:lastRenderedPageBreak/>
         <w:drawing>
-          <wp:inline distT="114300" distB="114300" distL="114300" distR="114300" wp14:anchorId="4D372D16" wp14:editId="58C97072">
+          <wp:inline distT="114300" distB="114300" distL="114300" distR="114300" wp14:anchorId="5CD23434" wp14:editId="07299E50">
             <wp:extent cx="5943600" cy="3962400"/>
             <wp:effectExtent l="0" t="0" r="0" b="0"/>
             <wp:docPr id="2" name="image4.png"/>
@@ -5027,7 +5089,7 @@
         <w:spacing w:before="480"/>
       </w:pPr>
       <w:r>
-        <w:pict w14:anchorId="42EB9BE2">
+        <w:pict w14:anchorId="430BAA0C">
           <v:rect id="_x0000_i1039" style="width:0;height:1.5pt" o:hralign="center" o:hrstd="t" o:hr="t" fillcolor="#a0a0a0" stroked="f"/>
         </w:pict>
       </w:r>
@@ -5064,21 +5126,12 @@
         </w:rPr>
         <w:t xml:space="preserve">: </w:t>
       </w:r>
-      <w:proofErr w:type="spellStart"/>
-      <w:r>
-        <w:rPr>
-          <w:b/>
-          <w:shd w:val="clear" w:color="auto" w:fill="B7B7B7"/>
-        </w:rPr>
-        <w:t>Chatgot</w:t>
-      </w:r>
-      <w:proofErr w:type="spellEnd"/>
-      <w:r>
-        <w:rPr>
-          <w:b/>
-          <w:shd w:val="clear" w:color="auto" w:fill="B7B7B7"/>
-        </w:rPr>
-        <w:t xml:space="preserve"> </w:t>
+      <w:r>
+        <w:rPr>
+          <w:b/>
+          <w:shd w:val="clear" w:color="auto" w:fill="B7B7B7"/>
+        </w:rPr>
+        <w:t xml:space="preserve">Chatgot </w:t>
       </w:r>
       <w:r>
         <w:rPr>
@@ -5087,7 +5140,26 @@
           <w:szCs w:val="14"/>
           <w:shd w:val="clear" w:color="auto" w:fill="B7B7B7"/>
         </w:rPr>
-        <w:t>(GPT-5-Standard) at [8/24/2025]</w:t>
+        <w:t>(GPT</w:t>
+      </w:r>
+      <w:r>
+        <w:rPr>
+          <w:rFonts w:ascii="Cambria Math" w:hAnsi="Cambria Math" w:cs="Cambria Math"/>
+          <w:b/>
+          <w:sz w:val="14"/>
+          <w:szCs w:val="14"/>
+          <w:shd w:val="clear" w:color="auto" w:fill="B7B7B7"/>
+        </w:rPr>
+        <w:t>‑</w:t>
+      </w:r>
+      <w:r>
+        <w:rPr>
+          <w:b/>
+          <w:sz w:val="14"/>
+          <w:szCs w:val="14"/>
+          <w:shd w:val="clear" w:color="auto" w:fill="B7B7B7"/>
+        </w:rPr>
+        <w:t>5 Mini) at [8/24/2025]</w:t>
       </w:r>
     </w:p>
     <w:p>
@@ -5172,8 +5244,7 @@
         <w:spacing w:before="480"/>
       </w:pPr>
       <w:r>
-        <w:lastRenderedPageBreak/>
-        <w:pict w14:anchorId="63C7F81A">
+        <w:pict w14:anchorId="3187594A">
           <v:rect id="_x0000_i1040" style="width:0;height:1.5pt" o:hralign="center" o:hrstd="t" o:hr="t" fillcolor="#a0a0a0" stroked="f"/>
         </w:pict>
       </w:r>
@@ -5200,6 +5271,7 @@
           <w:b/>
           <w:shd w:val="clear" w:color="auto" w:fill="B7B7B7"/>
         </w:rPr>
+        <w:lastRenderedPageBreak/>
         <w:t># Source</w:t>
       </w:r>
       <w:r>
@@ -5208,21 +5280,12 @@
         </w:rPr>
         <w:t xml:space="preserve">: </w:t>
       </w:r>
-      <w:proofErr w:type="spellStart"/>
-      <w:r>
-        <w:rPr>
-          <w:b/>
-          <w:shd w:val="clear" w:color="auto" w:fill="B7B7B7"/>
-        </w:rPr>
-        <w:t>Chatgot</w:t>
-      </w:r>
-      <w:proofErr w:type="spellEnd"/>
-      <w:r>
-        <w:rPr>
-          <w:b/>
-          <w:shd w:val="clear" w:color="auto" w:fill="B7B7B7"/>
-        </w:rPr>
-        <w:t xml:space="preserve"> </w:t>
+      <w:r>
+        <w:rPr>
+          <w:b/>
+          <w:shd w:val="clear" w:color="auto" w:fill="B7B7B7"/>
+        </w:rPr>
+        <w:t xml:space="preserve">Chatgot </w:t>
       </w:r>
       <w:r>
         <w:rPr>
@@ -5231,7 +5294,26 @@
           <w:szCs w:val="14"/>
           <w:shd w:val="clear" w:color="auto" w:fill="B7B7B7"/>
         </w:rPr>
-        <w:t>(GPT-5-Standard) at [8/18/2025]</w:t>
+        <w:t>(GPT</w:t>
+      </w:r>
+      <w:r>
+        <w:rPr>
+          <w:rFonts w:ascii="Cambria Math" w:hAnsi="Cambria Math" w:cs="Cambria Math"/>
+          <w:b/>
+          <w:sz w:val="14"/>
+          <w:szCs w:val="14"/>
+          <w:shd w:val="clear" w:color="auto" w:fill="B7B7B7"/>
+        </w:rPr>
+        <w:t>‑</w:t>
+      </w:r>
+      <w:r>
+        <w:rPr>
+          <w:b/>
+          <w:sz w:val="14"/>
+          <w:szCs w:val="14"/>
+          <w:shd w:val="clear" w:color="auto" w:fill="B7B7B7"/>
+        </w:rPr>
+        <w:t>5 Mini) at [8/18/2025]</w:t>
       </w:r>
     </w:p>
     <w:p>
@@ -5240,7 +5322,7 @@
           <w:noProof/>
         </w:rPr>
         <w:drawing>
-          <wp:inline distT="114300" distB="114300" distL="114300" distR="114300" wp14:anchorId="0985F6D5" wp14:editId="735B06BE">
+          <wp:inline distT="114300" distB="114300" distL="114300" distR="114300" wp14:anchorId="62AB1A5C" wp14:editId="591F1735">
             <wp:extent cx="5943600" cy="2235200"/>
             <wp:effectExtent l="0" t="0" r="0" b="0"/>
             <wp:docPr id="1" name="image2.png"/>
@@ -5364,21 +5446,7 @@
         <w:rPr>
           <w:rFonts w:ascii="Roboto Mono" w:eastAsia="Roboto Mono" w:hAnsi="Roboto Mono" w:cs="Roboto Mono"/>
         </w:rPr>
-        <w:t xml:space="preserve">       | Q4: Performance, Security, </w:t>
-      </w:r>
-      <w:proofErr w:type="gramStart"/>
-      <w:r>
-        <w:rPr>
-          <w:rFonts w:ascii="Roboto Mono" w:eastAsia="Roboto Mono" w:hAnsi="Roboto Mono" w:cs="Roboto Mono"/>
-        </w:rPr>
-        <w:t>NFR  |</w:t>
-      </w:r>
-      <w:proofErr w:type="gramEnd"/>
-      <w:r>
-        <w:rPr>
-          <w:rFonts w:ascii="Roboto Mono" w:eastAsia="Roboto Mono" w:hAnsi="Roboto Mono" w:cs="Roboto Mono"/>
-        </w:rPr>
-        <w:t xml:space="preserve">   Critique the Product</w:t>
+        <w:t xml:space="preserve">       | Q4: Performance, Security, NFR  |   Critique the Product</w:t>
       </w:r>
     </w:p>
     <w:p>
@@ -5410,7 +5478,7 @@
     <w:p/>
     <w:p>
       <w:r>
-        <w:pict w14:anchorId="061E9E2A">
+        <w:pict w14:anchorId="307937F0">
           <v:rect id="_x0000_i1041" style="width:0;height:1.5pt" o:hralign="center" o:hrstd="t" o:hr="t" fillcolor="#a0a0a0" stroked="f"/>
         </w:pict>
       </w:r>
@@ -5554,12 +5622,13 @@
     </w:p>
     <w:p>
       <w:r>
-        <w:lastRenderedPageBreak/>
-        <w:pict w14:anchorId="5FA65D8A">
+        <w:pict w14:anchorId="3563B3AD">
           <v:rect id="_x0000_i1042" style="width:0;height:1.5pt" o:hralign="center" o:hrstd="t" o:hr="t" fillcolor="#a0a0a0" stroked="f"/>
         </w:pict>
       </w:r>
     </w:p>
+    <w:p/>
+    <w:p/>
     <w:p/>
     <w:p/>
     <w:p/>
@@ -6975,15 +7044,17 @@
   <w:docDefaults>
     <w:rPrDefault>
       <w:rPr>
-        <w:rFonts w:ascii="Arial" w:eastAsia="Arial" w:hAnsi="Arial" w:cs="Arial"/>
-        <w:sz w:val="22"/>
-        <w:szCs w:val="22"/>
-        <w:lang w:val="en" w:eastAsia="en-US" w:bidi="ar-SA"/>
+        <w:rFonts w:asciiTheme="minorHAnsi" w:eastAsiaTheme="minorHAnsi" w:hAnsiTheme="minorHAnsi" w:cstheme="minorBidi"/>
+        <w:kern w:val="2"/>
+        <w:sz w:val="24"/>
+        <w:szCs w:val="24"/>
+        <w:lang w:val="en-US" w:eastAsia="en-US" w:bidi="ar-SA"/>
+        <w14:ligatures w14:val="standardContextual"/>
       </w:rPr>
     </w:rPrDefault>
     <w:pPrDefault>
       <w:pPr>
-        <w:spacing w:line="276" w:lineRule="auto"/>
+        <w:spacing w:after="160" w:line="278" w:lineRule="auto"/>
       </w:pPr>
     </w:pPrDefault>
   </w:docDefaults>
@@ -7368,20 +7439,36 @@
   <w:style w:type="paragraph" w:default="1" w:styleId="Normal">
     <w:name w:val="Normal"/>
     <w:qFormat/>
+    <w:rsid w:val="009B7DA7"/>
+    <w:pPr>
+      <w:spacing w:after="0" w:line="276" w:lineRule="auto"/>
+    </w:pPr>
+    <w:rPr>
+      <w:rFonts w:ascii="Arial" w:eastAsia="Arial" w:hAnsi="Arial" w:cs="Arial"/>
+      <w:kern w:val="0"/>
+      <w:sz w:val="22"/>
+      <w:szCs w:val="22"/>
+      <w:lang w:val="en"/>
+      <w14:ligatures w14:val="none"/>
+    </w:rPr>
   </w:style>
   <w:style w:type="paragraph" w:styleId="Heading1">
     <w:name w:val="heading 1"/>
     <w:basedOn w:val="Normal"/>
     <w:next w:val="Normal"/>
+    <w:link w:val="Heading1Char"/>
     <w:uiPriority w:val="9"/>
     <w:qFormat/>
+    <w:rsid w:val="00D37D9E"/>
     <w:pPr>
       <w:keepNext/>
       <w:keepLines/>
-      <w:spacing w:before="400" w:after="120"/>
+      <w:spacing w:before="360" w:after="80"/>
       <w:outlineLvl w:val="0"/>
     </w:pPr>
     <w:rPr>
+      <w:rFonts w:asciiTheme="majorHAnsi" w:eastAsiaTheme="majorEastAsia" w:hAnsiTheme="majorHAnsi" w:cstheme="majorBidi"/>
+      <w:color w:val="2F5496" w:themeColor="accent1" w:themeShade="BF"/>
       <w:sz w:val="40"/>
       <w:szCs w:val="40"/>
     </w:rPr>
@@ -7390,16 +7477,20 @@
     <w:name w:val="heading 2"/>
     <w:basedOn w:val="Normal"/>
     <w:next w:val="Normal"/>
+    <w:link w:val="Heading2Char"/>
     <w:uiPriority w:val="9"/>
     <w:unhideWhenUsed/>
     <w:qFormat/>
+    <w:rsid w:val="00D37D9E"/>
     <w:pPr>
       <w:keepNext/>
       <w:keepLines/>
-      <w:spacing w:before="360" w:after="120"/>
+      <w:spacing w:before="160" w:after="80"/>
       <w:outlineLvl w:val="1"/>
     </w:pPr>
     <w:rPr>
+      <w:rFonts w:asciiTheme="majorHAnsi" w:eastAsiaTheme="majorEastAsia" w:hAnsiTheme="majorHAnsi" w:cstheme="majorBidi"/>
+      <w:color w:val="2F5496" w:themeColor="accent1" w:themeShade="BF"/>
       <w:sz w:val="32"/>
       <w:szCs w:val="32"/>
     </w:rPr>
@@ -7408,17 +7499,20 @@
     <w:name w:val="heading 3"/>
     <w:basedOn w:val="Normal"/>
     <w:next w:val="Normal"/>
+    <w:link w:val="Heading3Char"/>
     <w:uiPriority w:val="9"/>
     <w:unhideWhenUsed/>
     <w:qFormat/>
+    <w:rsid w:val="00D37D9E"/>
     <w:pPr>
       <w:keepNext/>
       <w:keepLines/>
-      <w:spacing w:before="320" w:after="80"/>
+      <w:spacing w:before="160" w:after="80"/>
       <w:outlineLvl w:val="2"/>
     </w:pPr>
     <w:rPr>
-      <w:color w:val="434343"/>
+      <w:rFonts w:eastAsiaTheme="majorEastAsia" w:cstheme="majorBidi"/>
+      <w:color w:val="2F5496" w:themeColor="accent1" w:themeShade="BF"/>
       <w:sz w:val="28"/>
       <w:szCs w:val="28"/>
     </w:rPr>
@@ -7427,56 +7521,129 @@
     <w:name w:val="heading 4"/>
     <w:basedOn w:val="Normal"/>
     <w:next w:val="Normal"/>
+    <w:link w:val="Heading4Char"/>
     <w:uiPriority w:val="9"/>
     <w:unhideWhenUsed/>
     <w:qFormat/>
+    <w:rsid w:val="00D37D9E"/>
     <w:pPr>
       <w:keepNext/>
       <w:keepLines/>
-      <w:spacing w:before="280" w:after="80"/>
+      <w:spacing w:before="80" w:after="40"/>
       <w:outlineLvl w:val="3"/>
     </w:pPr>
     <w:rPr>
-      <w:color w:val="666666"/>
-      <w:sz w:val="24"/>
-      <w:szCs w:val="24"/>
+      <w:rFonts w:eastAsiaTheme="majorEastAsia" w:cstheme="majorBidi"/>
+      <w:i/>
+      <w:iCs/>
+      <w:color w:val="2F5496" w:themeColor="accent1" w:themeShade="BF"/>
     </w:rPr>
   </w:style>
   <w:style w:type="paragraph" w:styleId="Heading5">
     <w:name w:val="heading 5"/>
     <w:basedOn w:val="Normal"/>
     <w:next w:val="Normal"/>
+    <w:link w:val="Heading5Char"/>
     <w:uiPriority w:val="9"/>
     <w:semiHidden/>
     <w:unhideWhenUsed/>
     <w:qFormat/>
+    <w:rsid w:val="00D37D9E"/>
     <w:pPr>
       <w:keepNext/>
       <w:keepLines/>
-      <w:spacing w:before="240" w:after="80"/>
+      <w:spacing w:before="80" w:after="40"/>
       <w:outlineLvl w:val="4"/>
     </w:pPr>
     <w:rPr>
-      <w:color w:val="666666"/>
+      <w:rFonts w:eastAsiaTheme="majorEastAsia" w:cstheme="majorBidi"/>
+      <w:color w:val="2F5496" w:themeColor="accent1" w:themeShade="BF"/>
     </w:rPr>
   </w:style>
   <w:style w:type="paragraph" w:styleId="Heading6">
     <w:name w:val="heading 6"/>
     <w:basedOn w:val="Normal"/>
     <w:next w:val="Normal"/>
+    <w:link w:val="Heading6Char"/>
     <w:uiPriority w:val="9"/>
     <w:semiHidden/>
     <w:unhideWhenUsed/>
     <w:qFormat/>
+    <w:rsid w:val="00D37D9E"/>
     <w:pPr>
       <w:keepNext/>
       <w:keepLines/>
-      <w:spacing w:before="240" w:after="80"/>
+      <w:spacing w:before="40"/>
       <w:outlineLvl w:val="5"/>
     </w:pPr>
     <w:rPr>
+      <w:rFonts w:eastAsiaTheme="majorEastAsia" w:cstheme="majorBidi"/>
       <w:i/>
-      <w:color w:val="666666"/>
+      <w:iCs/>
+      <w:color w:val="595959" w:themeColor="text1" w:themeTint="A6"/>
+    </w:rPr>
+  </w:style>
+  <w:style w:type="paragraph" w:styleId="Heading7">
+    <w:name w:val="heading 7"/>
+    <w:basedOn w:val="Normal"/>
+    <w:next w:val="Normal"/>
+    <w:link w:val="Heading7Char"/>
+    <w:uiPriority w:val="9"/>
+    <w:semiHidden/>
+    <w:unhideWhenUsed/>
+    <w:qFormat/>
+    <w:rsid w:val="00D37D9E"/>
+    <w:pPr>
+      <w:keepNext/>
+      <w:keepLines/>
+      <w:spacing w:before="40"/>
+      <w:outlineLvl w:val="6"/>
+    </w:pPr>
+    <w:rPr>
+      <w:rFonts w:eastAsiaTheme="majorEastAsia" w:cstheme="majorBidi"/>
+      <w:color w:val="595959" w:themeColor="text1" w:themeTint="A6"/>
+    </w:rPr>
+  </w:style>
+  <w:style w:type="paragraph" w:styleId="Heading8">
+    <w:name w:val="heading 8"/>
+    <w:basedOn w:val="Normal"/>
+    <w:next w:val="Normal"/>
+    <w:link w:val="Heading8Char"/>
+    <w:uiPriority w:val="9"/>
+    <w:semiHidden/>
+    <w:unhideWhenUsed/>
+    <w:qFormat/>
+    <w:rsid w:val="00D37D9E"/>
+    <w:pPr>
+      <w:keepNext/>
+      <w:keepLines/>
+      <w:outlineLvl w:val="7"/>
+    </w:pPr>
+    <w:rPr>
+      <w:rFonts w:eastAsiaTheme="majorEastAsia" w:cstheme="majorBidi"/>
+      <w:i/>
+      <w:iCs/>
+      <w:color w:val="272727" w:themeColor="text1" w:themeTint="D8"/>
+    </w:rPr>
+  </w:style>
+  <w:style w:type="paragraph" w:styleId="Heading9">
+    <w:name w:val="heading 9"/>
+    <w:basedOn w:val="Normal"/>
+    <w:next w:val="Normal"/>
+    <w:link w:val="Heading9Char"/>
+    <w:uiPriority w:val="9"/>
+    <w:semiHidden/>
+    <w:unhideWhenUsed/>
+    <w:qFormat/>
+    <w:rsid w:val="00D37D9E"/>
+    <w:pPr>
+      <w:keepNext/>
+      <w:keepLines/>
+      <w:outlineLvl w:val="8"/>
+    </w:pPr>
+    <w:rPr>
+      <w:rFonts w:eastAsiaTheme="majorEastAsia" w:cstheme="majorBidi"/>
+      <w:color w:val="272727" w:themeColor="text1" w:themeTint="D8"/>
     </w:rPr>
   </w:style>
   <w:style w:type="character" w:default="1" w:styleId="DefaultParagraphFont">
@@ -7506,75 +7673,292 @@
     <w:semiHidden/>
     <w:unhideWhenUsed/>
   </w:style>
-  <w:style w:type="table" w:customStyle="1" w:styleId="TableNormal0">
-    <w:name w:val="TableNormal"/>
-    <w:tblPr>
-      <w:tblCellMar>
-        <w:top w:w="0" w:type="dxa"/>
-        <w:left w:w="0" w:type="dxa"/>
-        <w:bottom w:w="0" w:type="dxa"/>
-        <w:right w:w="0" w:type="dxa"/>
-      </w:tblCellMar>
-    </w:tblPr>
+  <w:style w:type="character" w:customStyle="1" w:styleId="Heading1Char">
+    <w:name w:val="Heading 1 Char"/>
+    <w:basedOn w:val="DefaultParagraphFont"/>
+    <w:link w:val="Heading1"/>
+    <w:uiPriority w:val="9"/>
+    <w:rsid w:val="00D37D9E"/>
+    <w:rPr>
+      <w:rFonts w:asciiTheme="majorHAnsi" w:eastAsiaTheme="majorEastAsia" w:hAnsiTheme="majorHAnsi" w:cstheme="majorBidi"/>
+      <w:color w:val="2F5496" w:themeColor="accent1" w:themeShade="BF"/>
+      <w:sz w:val="40"/>
+      <w:szCs w:val="40"/>
+    </w:rPr>
+  </w:style>
+  <w:style w:type="character" w:customStyle="1" w:styleId="Heading2Char">
+    <w:name w:val="Heading 2 Char"/>
+    <w:basedOn w:val="DefaultParagraphFont"/>
+    <w:link w:val="Heading2"/>
+    <w:uiPriority w:val="9"/>
+    <w:rsid w:val="00D37D9E"/>
+    <w:rPr>
+      <w:rFonts w:asciiTheme="majorHAnsi" w:eastAsiaTheme="majorEastAsia" w:hAnsiTheme="majorHAnsi" w:cstheme="majorBidi"/>
+      <w:color w:val="2F5496" w:themeColor="accent1" w:themeShade="BF"/>
+      <w:sz w:val="32"/>
+      <w:szCs w:val="32"/>
+    </w:rPr>
+  </w:style>
+  <w:style w:type="character" w:customStyle="1" w:styleId="Heading3Char">
+    <w:name w:val="Heading 3 Char"/>
+    <w:basedOn w:val="DefaultParagraphFont"/>
+    <w:link w:val="Heading3"/>
+    <w:uiPriority w:val="9"/>
+    <w:rsid w:val="00D37D9E"/>
+    <w:rPr>
+      <w:rFonts w:eastAsiaTheme="majorEastAsia" w:cstheme="majorBidi"/>
+      <w:color w:val="2F5496" w:themeColor="accent1" w:themeShade="BF"/>
+      <w:sz w:val="28"/>
+      <w:szCs w:val="28"/>
+    </w:rPr>
+  </w:style>
+  <w:style w:type="character" w:customStyle="1" w:styleId="Heading4Char">
+    <w:name w:val="Heading 4 Char"/>
+    <w:basedOn w:val="DefaultParagraphFont"/>
+    <w:link w:val="Heading4"/>
+    <w:uiPriority w:val="9"/>
+    <w:rsid w:val="00D37D9E"/>
+    <w:rPr>
+      <w:rFonts w:eastAsiaTheme="majorEastAsia" w:cstheme="majorBidi"/>
+      <w:i/>
+      <w:iCs/>
+      <w:color w:val="2F5496" w:themeColor="accent1" w:themeShade="BF"/>
+    </w:rPr>
+  </w:style>
+  <w:style w:type="character" w:customStyle="1" w:styleId="Heading5Char">
+    <w:name w:val="Heading 5 Char"/>
+    <w:basedOn w:val="DefaultParagraphFont"/>
+    <w:link w:val="Heading5"/>
+    <w:uiPriority w:val="9"/>
+    <w:semiHidden/>
+    <w:rsid w:val="00D37D9E"/>
+    <w:rPr>
+      <w:rFonts w:eastAsiaTheme="majorEastAsia" w:cstheme="majorBidi"/>
+      <w:color w:val="2F5496" w:themeColor="accent1" w:themeShade="BF"/>
+    </w:rPr>
+  </w:style>
+  <w:style w:type="character" w:customStyle="1" w:styleId="Heading6Char">
+    <w:name w:val="Heading 6 Char"/>
+    <w:basedOn w:val="DefaultParagraphFont"/>
+    <w:link w:val="Heading6"/>
+    <w:uiPriority w:val="9"/>
+    <w:semiHidden/>
+    <w:rsid w:val="00D37D9E"/>
+    <w:rPr>
+      <w:rFonts w:eastAsiaTheme="majorEastAsia" w:cstheme="majorBidi"/>
+      <w:i/>
+      <w:iCs/>
+      <w:color w:val="595959" w:themeColor="text1" w:themeTint="A6"/>
+    </w:rPr>
+  </w:style>
+  <w:style w:type="character" w:customStyle="1" w:styleId="Heading7Char">
+    <w:name w:val="Heading 7 Char"/>
+    <w:basedOn w:val="DefaultParagraphFont"/>
+    <w:link w:val="Heading7"/>
+    <w:uiPriority w:val="9"/>
+    <w:semiHidden/>
+    <w:rsid w:val="00D37D9E"/>
+    <w:rPr>
+      <w:rFonts w:eastAsiaTheme="majorEastAsia" w:cstheme="majorBidi"/>
+      <w:color w:val="595959" w:themeColor="text1" w:themeTint="A6"/>
+    </w:rPr>
+  </w:style>
+  <w:style w:type="character" w:customStyle="1" w:styleId="Heading8Char">
+    <w:name w:val="Heading 8 Char"/>
+    <w:basedOn w:val="DefaultParagraphFont"/>
+    <w:link w:val="Heading8"/>
+    <w:uiPriority w:val="9"/>
+    <w:semiHidden/>
+    <w:rsid w:val="00D37D9E"/>
+    <w:rPr>
+      <w:rFonts w:eastAsiaTheme="majorEastAsia" w:cstheme="majorBidi"/>
+      <w:i/>
+      <w:iCs/>
+      <w:color w:val="272727" w:themeColor="text1" w:themeTint="D8"/>
+    </w:rPr>
+  </w:style>
+  <w:style w:type="character" w:customStyle="1" w:styleId="Heading9Char">
+    <w:name w:val="Heading 9 Char"/>
+    <w:basedOn w:val="DefaultParagraphFont"/>
+    <w:link w:val="Heading9"/>
+    <w:uiPriority w:val="9"/>
+    <w:semiHidden/>
+    <w:rsid w:val="00D37D9E"/>
+    <w:rPr>
+      <w:rFonts w:eastAsiaTheme="majorEastAsia" w:cstheme="majorBidi"/>
+      <w:color w:val="272727" w:themeColor="text1" w:themeTint="D8"/>
+    </w:rPr>
   </w:style>
   <w:style w:type="paragraph" w:styleId="Title">
     <w:name w:val="Title"/>
     <w:basedOn w:val="Normal"/>
     <w:next w:val="Normal"/>
+    <w:link w:val="TitleChar"/>
     <w:uiPriority w:val="10"/>
     <w:qFormat/>
+    <w:rsid w:val="00D37D9E"/>
     <w:pPr>
-      <w:keepNext/>
-      <w:keepLines/>
-      <w:spacing w:after="60"/>
+      <w:spacing w:after="80" w:line="240" w:lineRule="auto"/>
+      <w:contextualSpacing/>
     </w:pPr>
     <w:rPr>
-      <w:sz w:val="52"/>
-      <w:szCs w:val="52"/>
+      <w:rFonts w:asciiTheme="majorHAnsi" w:eastAsiaTheme="majorEastAsia" w:hAnsiTheme="majorHAnsi" w:cstheme="majorBidi"/>
+      <w:spacing w:val="-10"/>
+      <w:kern w:val="28"/>
+      <w:sz w:val="56"/>
+      <w:szCs w:val="56"/>
+    </w:rPr>
+  </w:style>
+  <w:style w:type="character" w:customStyle="1" w:styleId="TitleChar">
+    <w:name w:val="Title Char"/>
+    <w:basedOn w:val="DefaultParagraphFont"/>
+    <w:link w:val="Title"/>
+    <w:uiPriority w:val="10"/>
+    <w:rsid w:val="00D37D9E"/>
+    <w:rPr>
+      <w:rFonts w:asciiTheme="majorHAnsi" w:eastAsiaTheme="majorEastAsia" w:hAnsiTheme="majorHAnsi" w:cstheme="majorBidi"/>
+      <w:spacing w:val="-10"/>
+      <w:kern w:val="28"/>
+      <w:sz w:val="56"/>
+      <w:szCs w:val="56"/>
     </w:rPr>
   </w:style>
   <w:style w:type="paragraph" w:styleId="Subtitle">
     <w:name w:val="Subtitle"/>
     <w:basedOn w:val="Normal"/>
     <w:next w:val="Normal"/>
+    <w:link w:val="SubtitleChar"/>
     <w:uiPriority w:val="11"/>
     <w:qFormat/>
+    <w:rsid w:val="00D37D9E"/>
     <w:pPr>
-      <w:keepNext/>
-      <w:keepLines/>
-      <w:spacing w:after="320"/>
+      <w:numPr>
+        <w:ilvl w:val="1"/>
+      </w:numPr>
     </w:pPr>
     <w:rPr>
-      <w:color w:val="666666"/>
-      <w:sz w:val="30"/>
-      <w:szCs w:val="30"/>
+      <w:rFonts w:eastAsiaTheme="majorEastAsia" w:cstheme="majorBidi"/>
+      <w:color w:val="595959" w:themeColor="text1" w:themeTint="A6"/>
+      <w:spacing w:val="15"/>
+      <w:sz w:val="28"/>
+      <w:szCs w:val="28"/>
     </w:rPr>
   </w:style>
-  <w:style w:type="table" w:customStyle="1" w:styleId="a">
-    <w:basedOn w:val="TableNormal0"/>
-    <w:tblPr>
-      <w:tblStyleRowBandSize w:val="1"/>
-      <w:tblStyleColBandSize w:val="1"/>
-      <w:tblCellMar>
-        <w:top w:w="100" w:type="dxa"/>
-        <w:left w:w="100" w:type="dxa"/>
-        <w:bottom w:w="100" w:type="dxa"/>
-        <w:right w:w="100" w:type="dxa"/>
-      </w:tblCellMar>
-    </w:tblPr>
+  <w:style w:type="character" w:customStyle="1" w:styleId="SubtitleChar">
+    <w:name w:val="Subtitle Char"/>
+    <w:basedOn w:val="DefaultParagraphFont"/>
+    <w:link w:val="Subtitle"/>
+    <w:uiPriority w:val="11"/>
+    <w:rsid w:val="00D37D9E"/>
+    <w:rPr>
+      <w:rFonts w:eastAsiaTheme="majorEastAsia" w:cstheme="majorBidi"/>
+      <w:color w:val="595959" w:themeColor="text1" w:themeTint="A6"/>
+      <w:spacing w:val="15"/>
+      <w:sz w:val="28"/>
+      <w:szCs w:val="28"/>
+    </w:rPr>
   </w:style>
-  <w:style w:type="table" w:customStyle="1" w:styleId="a0">
-    <w:basedOn w:val="TableNormal0"/>
-    <w:tblPr>
-      <w:tblStyleRowBandSize w:val="1"/>
-      <w:tblStyleColBandSize w:val="1"/>
-      <w:tblCellMar>
-        <w:top w:w="100" w:type="dxa"/>
-        <w:left w:w="100" w:type="dxa"/>
-        <w:bottom w:w="100" w:type="dxa"/>
-        <w:right w:w="100" w:type="dxa"/>
-      </w:tblCellMar>
-    </w:tblPr>
+  <w:style w:type="paragraph" w:styleId="Quote">
+    <w:name w:val="Quote"/>
+    <w:basedOn w:val="Normal"/>
+    <w:next w:val="Normal"/>
+    <w:link w:val="QuoteChar"/>
+    <w:uiPriority w:val="29"/>
+    <w:qFormat/>
+    <w:rsid w:val="00D37D9E"/>
+    <w:pPr>
+      <w:spacing w:before="160"/>
+      <w:jc w:val="center"/>
+    </w:pPr>
+    <w:rPr>
+      <w:i/>
+      <w:iCs/>
+      <w:color w:val="404040" w:themeColor="text1" w:themeTint="BF"/>
+    </w:rPr>
+  </w:style>
+  <w:style w:type="character" w:customStyle="1" w:styleId="QuoteChar">
+    <w:name w:val="Quote Char"/>
+    <w:basedOn w:val="DefaultParagraphFont"/>
+    <w:link w:val="Quote"/>
+    <w:uiPriority w:val="29"/>
+    <w:rsid w:val="00D37D9E"/>
+    <w:rPr>
+      <w:i/>
+      <w:iCs/>
+      <w:color w:val="404040" w:themeColor="text1" w:themeTint="BF"/>
+    </w:rPr>
+  </w:style>
+  <w:style w:type="paragraph" w:styleId="ListParagraph">
+    <w:name w:val="List Paragraph"/>
+    <w:basedOn w:val="Normal"/>
+    <w:uiPriority w:val="34"/>
+    <w:qFormat/>
+    <w:rsid w:val="00D37D9E"/>
+    <w:pPr>
+      <w:ind w:left="720"/>
+      <w:contextualSpacing/>
+    </w:pPr>
+  </w:style>
+  <w:style w:type="character" w:styleId="IntenseEmphasis">
+    <w:name w:val="Intense Emphasis"/>
+    <w:basedOn w:val="DefaultParagraphFont"/>
+    <w:uiPriority w:val="21"/>
+    <w:qFormat/>
+    <w:rsid w:val="00D37D9E"/>
+    <w:rPr>
+      <w:i/>
+      <w:iCs/>
+      <w:color w:val="2F5496" w:themeColor="accent1" w:themeShade="BF"/>
+    </w:rPr>
+  </w:style>
+  <w:style w:type="paragraph" w:styleId="IntenseQuote">
+    <w:name w:val="Intense Quote"/>
+    <w:basedOn w:val="Normal"/>
+    <w:next w:val="Normal"/>
+    <w:link w:val="IntenseQuoteChar"/>
+    <w:uiPriority w:val="30"/>
+    <w:qFormat/>
+    <w:rsid w:val="00D37D9E"/>
+    <w:pPr>
+      <w:pBdr>
+        <w:top w:val="single" w:sz="4" w:space="10" w:color="2F5496" w:themeColor="accent1" w:themeShade="BF"/>
+        <w:bottom w:val="single" w:sz="4" w:space="10" w:color="2F5496" w:themeColor="accent1" w:themeShade="BF"/>
+      </w:pBdr>
+      <w:spacing w:before="360" w:after="360"/>
+      <w:ind w:left="864" w:right="864"/>
+      <w:jc w:val="center"/>
+    </w:pPr>
+    <w:rPr>
+      <w:i/>
+      <w:iCs/>
+      <w:color w:val="2F5496" w:themeColor="accent1" w:themeShade="BF"/>
+    </w:rPr>
+  </w:style>
+  <w:style w:type="character" w:customStyle="1" w:styleId="IntenseQuoteChar">
+    <w:name w:val="Intense Quote Char"/>
+    <w:basedOn w:val="DefaultParagraphFont"/>
+    <w:link w:val="IntenseQuote"/>
+    <w:uiPriority w:val="30"/>
+    <w:rsid w:val="00D37D9E"/>
+    <w:rPr>
+      <w:i/>
+      <w:iCs/>
+      <w:color w:val="2F5496" w:themeColor="accent1" w:themeShade="BF"/>
+    </w:rPr>
+  </w:style>
+  <w:style w:type="character" w:styleId="IntenseReference">
+    <w:name w:val="Intense Reference"/>
+    <w:basedOn w:val="DefaultParagraphFont"/>
+    <w:uiPriority w:val="32"/>
+    <w:qFormat/>
+    <w:rsid w:val="00D37D9E"/>
+    <w:rPr>
+      <w:b/>
+      <w:bCs/>
+      <w:smallCaps/>
+      <w:color w:val="2F5496" w:themeColor="accent1" w:themeShade="BF"/>
+      <w:spacing w:val="5"/>
+    </w:rPr>
   </w:style>
 </w:styles>
 </file>
@@ -7590,44 +7974,44 @@
         <a:sysClr val="window" lastClr="FFFFFF"/>
       </a:lt1>
       <a:dk2>
-        <a:srgbClr val="1F497D"/>
+        <a:srgbClr val="44546A"/>
       </a:dk2>
       <a:lt2>
-        <a:srgbClr val="EEECE1"/>
+        <a:srgbClr val="E7E6E6"/>
       </a:lt2>
       <a:accent1>
-        <a:srgbClr val="4F81BD"/>
+        <a:srgbClr val="4472C4"/>
       </a:accent1>
       <a:accent2>
-        <a:srgbClr val="C0504D"/>
+        <a:srgbClr val="ED7D31"/>
       </a:accent2>
       <a:accent3>
-        <a:srgbClr val="9BBB59"/>
+        <a:srgbClr val="A5A5A5"/>
       </a:accent3>
       <a:accent4>
-        <a:srgbClr val="8064A2"/>
+        <a:srgbClr val="FFC000"/>
       </a:accent4>
       <a:accent5>
-        <a:srgbClr val="4BACC6"/>
+        <a:srgbClr val="5B9BD5"/>
       </a:accent5>
       <a:accent6>
-        <a:srgbClr val="F79646"/>
+        <a:srgbClr val="70AD47"/>
       </a:accent6>
       <a:hlink>
-        <a:srgbClr val="0000FF"/>
+        <a:srgbClr val="0563C1"/>
       </a:hlink>
       <a:folHlink>
-        <a:srgbClr val="800080"/>
+        <a:srgbClr val="954F72"/>
       </a:folHlink>
     </a:clrScheme>
     <a:fontScheme name="Office">
       <a:majorFont>
-        <a:latin typeface="Calibri"/>
+        <a:latin typeface="Calibri Light" panose="020F0302020204030204"/>
         <a:ea typeface=""/>
         <a:cs typeface=""/>
-        <a:font script="Jpan" typeface="ＭＳ ゴシック"/>
+        <a:font script="Jpan" typeface="游ゴシック Light"/>
         <a:font script="Hang" typeface="맑은 고딕"/>
-        <a:font script="Hans" typeface="宋体"/>
+        <a:font script="Hans" typeface="等线 Light"/>
         <a:font script="Hant" typeface="新細明體"/>
         <a:font script="Arab" typeface="Times New Roman"/>
         <a:font script="Hebr" typeface="Times New Roman"/>
@@ -7655,14 +8039,31 @@
         <a:font script="Viet" typeface="Times New Roman"/>
         <a:font script="Uigh" typeface="Microsoft Uighur"/>
         <a:font script="Geor" typeface="Sylfaen"/>
+        <a:font script="Armn" typeface="Arial"/>
+        <a:font script="Bugi" typeface="Leelawadee UI"/>
+        <a:font script="Bopo" typeface="Microsoft JhengHei"/>
+        <a:font script="Java" typeface="Javanese Text"/>
+        <a:font script="Lisu" typeface="Segoe UI"/>
+        <a:font script="Mymr" typeface="Myanmar Text"/>
+        <a:font script="Nkoo" typeface="Ebrima"/>
+        <a:font script="Olck" typeface="Nirmala UI"/>
+        <a:font script="Osma" typeface="Ebrima"/>
+        <a:font script="Phag" typeface="Phagspa"/>
+        <a:font script="Syrn" typeface="Estrangelo Edessa"/>
+        <a:font script="Syrj" typeface="Estrangelo Edessa"/>
+        <a:font script="Syre" typeface="Estrangelo Edessa"/>
+        <a:font script="Sora" typeface="Nirmala UI"/>
+        <a:font script="Tale" typeface="Microsoft Tai Le"/>
+        <a:font script="Talu" typeface="Microsoft New Tai Lue"/>
+        <a:font script="Tfng" typeface="Ebrima"/>
       </a:majorFont>
       <a:minorFont>
-        <a:latin typeface="Cambria"/>
+        <a:latin typeface="Calibri" panose="020F0502020204030204"/>
         <a:ea typeface=""/>
         <a:cs typeface=""/>
-        <a:font script="Jpan" typeface="ＭＳ 明朝"/>
+        <a:font script="Jpan" typeface="游ゴシック"/>
         <a:font script="Hang" typeface="맑은 고딕"/>
-        <a:font script="Hans" typeface="宋体"/>
+        <a:font script="Hans" typeface="等线"/>
         <a:font script="Hant" typeface="新細明體"/>
         <a:font script="Arab" typeface="Arial"/>
         <a:font script="Hebr" typeface="Arial"/>
@@ -7690,6 +8091,23 @@
         <a:font script="Viet" typeface="Arial"/>
         <a:font script="Uigh" typeface="Microsoft Uighur"/>
         <a:font script="Geor" typeface="Sylfaen"/>
+        <a:font script="Armn" typeface="Arial"/>
+        <a:font script="Bugi" typeface="Leelawadee UI"/>
+        <a:font script="Bopo" typeface="Microsoft JhengHei"/>
+        <a:font script="Java" typeface="Javanese Text"/>
+        <a:font script="Lisu" typeface="Segoe UI"/>
+        <a:font script="Mymr" typeface="Myanmar Text"/>
+        <a:font script="Nkoo" typeface="Ebrima"/>
+        <a:font script="Olck" typeface="Nirmala UI"/>
+        <a:font script="Osma" typeface="Ebrima"/>
+        <a:font script="Phag" typeface="Phagspa"/>
+        <a:font script="Syrn" typeface="Estrangelo Edessa"/>
+        <a:font script="Syrj" typeface="Estrangelo Edessa"/>
+        <a:font script="Syre" typeface="Estrangelo Edessa"/>
+        <a:font script="Sora" typeface="Nirmala UI"/>
+        <a:font script="Tale" typeface="Microsoft Tai Le"/>
+        <a:font script="Talu" typeface="Microsoft New Tai Lue"/>
+        <a:font script="Tfng" typeface="Ebrima"/>
       </a:minorFont>
     </a:fontScheme>
     <a:fmtScheme name="Office">
@@ -7701,200 +8119,141 @@
           <a:gsLst>
             <a:gs pos="0">
               <a:schemeClr val="phClr">
-                <a:tint val="50000"/>
-                <a:satMod val="300000"/>
+                <a:lumMod val="110000"/>
+                <a:satMod val="105000"/>
+                <a:tint val="67000"/>
               </a:schemeClr>
             </a:gs>
-            <a:gs pos="35000">
+            <a:gs pos="50000">
               <a:schemeClr val="phClr">
-                <a:tint val="37000"/>
-                <a:satMod val="300000"/>
+                <a:lumMod val="105000"/>
+                <a:satMod val="103000"/>
+                <a:tint val="73000"/>
               </a:schemeClr>
             </a:gs>
             <a:gs pos="100000">
               <a:schemeClr val="phClr">
-                <a:tint val="15000"/>
-                <a:satMod val="350000"/>
+                <a:lumMod val="105000"/>
+                <a:satMod val="109000"/>
+                <a:tint val="81000"/>
               </a:schemeClr>
             </a:gs>
           </a:gsLst>
-          <a:lin ang="16200000" scaled="1"/>
+          <a:lin ang="5400000" scaled="0"/>
         </a:gradFill>
         <a:gradFill rotWithShape="1">
           <a:gsLst>
             <a:gs pos="0">
               <a:schemeClr val="phClr">
-                <a:tint val="100000"/>
+                <a:satMod val="103000"/>
+                <a:lumMod val="102000"/>
+                <a:tint val="94000"/>
+              </a:schemeClr>
+            </a:gs>
+            <a:gs pos="50000">
+              <a:schemeClr val="phClr">
+                <a:satMod val="110000"/>
+                <a:lumMod val="100000"/>
                 <a:shade val="100000"/>
-                <a:satMod val="130000"/>
               </a:schemeClr>
             </a:gs>
             <a:gs pos="100000">
               <a:schemeClr val="phClr">
-                <a:tint val="50000"/>
-                <a:shade val="100000"/>
-                <a:satMod val="350000"/>
+                <a:lumMod val="99000"/>
+                <a:satMod val="120000"/>
+                <a:shade val="78000"/>
               </a:schemeClr>
             </a:gs>
           </a:gsLst>
-          <a:lin ang="16200000" scaled="0"/>
+          <a:lin ang="5400000" scaled="0"/>
         </a:gradFill>
       </a:fillStyleLst>
       <a:lnStyleLst>
-        <a:ln w="9525" cap="flat" cmpd="sng" algn="ctr">
-          <a:solidFill>
-            <a:schemeClr val="phClr">
-              <a:shade val="95000"/>
-              <a:satMod val="105000"/>
-            </a:schemeClr>
-          </a:solidFill>
-          <a:prstDash val="solid"/>
-        </a:ln>
-        <a:ln w="25400" cap="flat" cmpd="sng" algn="ctr">
+        <a:ln w="6350" cap="flat" cmpd="sng" algn="ctr">
           <a:solidFill>
             <a:schemeClr val="phClr"/>
           </a:solidFill>
           <a:prstDash val="solid"/>
+          <a:miter lim="800000"/>
         </a:ln>
-        <a:ln w="38100" cap="flat" cmpd="sng" algn="ctr">
+        <a:ln w="12700" cap="flat" cmpd="sng" algn="ctr">
           <a:solidFill>
             <a:schemeClr val="phClr"/>
           </a:solidFill>
           <a:prstDash val="solid"/>
+          <a:miter lim="800000"/>
+        </a:ln>
+        <a:ln w="19050" cap="flat" cmpd="sng" algn="ctr">
+          <a:solidFill>
+            <a:schemeClr val="phClr"/>
+          </a:solidFill>
+          <a:prstDash val="solid"/>
+          <a:miter lim="800000"/>
         </a:ln>
       </a:lnStyleLst>
       <a:effectStyleLst>
         <a:effectStyle>
+          <a:effectLst/>
+        </a:effectStyle>
+        <a:effectStyle>
+          <a:effectLst/>
+        </a:effectStyle>
+        <a:effectStyle>
           <a:effectLst>
-            <a:outerShdw blurRad="40000" dist="20000" dir="5400000" rotWithShape="0">
+            <a:outerShdw blurRad="57150" dist="19050" dir="5400000" algn="ctr" rotWithShape="0">
               <a:srgbClr val="000000">
-                <a:alpha val="38000"/>
+                <a:alpha val="63000"/>
               </a:srgbClr>
             </a:outerShdw>
           </a:effectLst>
-        </a:effectStyle>
-        <a:effectStyle>
-          <a:effectLst>
-            <a:outerShdw blurRad="40000" dist="23000" dir="5400000" rotWithShape="0">
-              <a:srgbClr val="000000">
-                <a:alpha val="35000"/>
-              </a:srgbClr>
-            </a:outerShdw>
-          </a:effectLst>
-        </a:effectStyle>
-        <a:effectStyle>
-          <a:effectLst>
-            <a:outerShdw blurRad="40000" dist="23000" dir="5400000" rotWithShape="0">
-              <a:srgbClr val="000000">
-                <a:alpha val="35000"/>
-              </a:srgbClr>
-            </a:outerShdw>
-          </a:effectLst>
-          <a:scene3d>
-            <a:camera prst="orthographicFront">
-              <a:rot lat="0" lon="0" rev="0"/>
-            </a:camera>
-            <a:lightRig rig="threePt" dir="t">
-              <a:rot lat="0" lon="0" rev="1200000"/>
-            </a:lightRig>
-          </a:scene3d>
-          <a:sp3d>
-            <a:bevelT w="63500" h="25400"/>
-          </a:sp3d>
         </a:effectStyle>
       </a:effectStyleLst>
       <a:bgFillStyleLst>
         <a:solidFill>
           <a:schemeClr val="phClr"/>
         </a:solidFill>
+        <a:solidFill>
+          <a:schemeClr val="phClr">
+            <a:tint val="95000"/>
+            <a:satMod val="170000"/>
+          </a:schemeClr>
+        </a:solidFill>
         <a:gradFill rotWithShape="1">
           <a:gsLst>
             <a:gs pos="0">
               <a:schemeClr val="phClr">
-                <a:tint val="40000"/>
-                <a:satMod val="350000"/>
+                <a:tint val="93000"/>
+                <a:satMod val="150000"/>
+                <a:shade val="98000"/>
+                <a:lumMod val="102000"/>
               </a:schemeClr>
             </a:gs>
-            <a:gs pos="40000">
+            <a:gs pos="50000">
               <a:schemeClr val="phClr">
-                <a:tint val="45000"/>
-                <a:shade val="99000"/>
-                <a:satMod val="350000"/>
+                <a:tint val="98000"/>
+                <a:satMod val="130000"/>
+                <a:shade val="90000"/>
+                <a:lumMod val="103000"/>
               </a:schemeClr>
             </a:gs>
             <a:gs pos="100000">
               <a:schemeClr val="phClr">
-                <a:shade val="20000"/>
-                <a:satMod val="255000"/>
+                <a:shade val="63000"/>
+                <a:satMod val="120000"/>
               </a:schemeClr>
             </a:gs>
           </a:gsLst>
-          <a:path path="circle">
-            <a:fillToRect l="50000" t="-80000" r="50000" b="180000"/>
-          </a:path>
-        </a:gradFill>
-        <a:gradFill rotWithShape="1">
-          <a:gsLst>
-            <a:gs pos="0">
-              <a:schemeClr val="phClr">
-                <a:tint val="80000"/>
-                <a:satMod val="300000"/>
-              </a:schemeClr>
-            </a:gs>
-            <a:gs pos="100000">
-              <a:schemeClr val="phClr">
-                <a:shade val="30000"/>
-                <a:satMod val="200000"/>
-              </a:schemeClr>
-            </a:gs>
-          </a:gsLst>
-          <a:path path="circle">
-            <a:fillToRect l="50000" t="50000" r="50000" b="50000"/>
-          </a:path>
+          <a:lin ang="5400000" scaled="0"/>
         </a:gradFill>
       </a:bgFillStyleLst>
     </a:fmtScheme>
   </a:themeElements>
-  <a:objectDefaults>
-    <a:spDef>
-      <a:spPr/>
-      <a:bodyPr/>
-      <a:lstStyle/>
-      <a:style>
-        <a:lnRef idx="1">
-          <a:schemeClr val="accent1"/>
-        </a:lnRef>
-        <a:fillRef idx="3">
-          <a:schemeClr val="accent1"/>
-        </a:fillRef>
-        <a:effectRef idx="2">
-          <a:schemeClr val="accent1"/>
-        </a:effectRef>
-        <a:fontRef idx="minor">
-          <a:schemeClr val="lt1"/>
-        </a:fontRef>
-      </a:style>
-    </a:spDef>
-    <a:lnDef>
-      <a:spPr/>
-      <a:bodyPr/>
-      <a:lstStyle/>
-      <a:style>
-        <a:lnRef idx="2">
-          <a:schemeClr val="accent1"/>
-        </a:lnRef>
-        <a:fillRef idx="0">
-          <a:schemeClr val="accent1"/>
-        </a:fillRef>
-        <a:effectRef idx="1">
-          <a:schemeClr val="accent1"/>
-        </a:effectRef>
-        <a:fontRef idx="minor">
-          <a:schemeClr val="tx1"/>
-        </a:fontRef>
-      </a:style>
-    </a:lnDef>
-  </a:objectDefaults>
+  <a:objectDefaults/>
   <a:extraClrSchemeLst/>
+  <a:extLst>
+    <a:ext uri="{05A4C25C-085E-4340-85A3-A5531E510DB2}">
+      <thm15:themeFamily xmlns:thm15="http://schemas.microsoft.com/office/thememl/2012/main" name="Office Theme" id="{62F939B6-93AF-4DB8-9C6B-D6C7DFDC589F}" vid="{4A3C46E8-61CC-4603-A589-7422A47A8E4A}"/>
+    </a:ext>
+  </a:extLst>
 </a:theme>
 </file>
</xml_diff>

<commit_message>
Knowledge - 3-Work knowledge - fix location - part 29 - 11/9/2025
</commit_message>
<xml_diff>
--- a/Knowledge/3-Work knowledge/1-Software Engineering/1-Testing/5-My Source/1-ISTQB Foundation Level/7-Test Levels, Test Types and Testing Quadrants.docx
+++ b/Knowledge/3-Work knowledge/1-Software Engineering/1-Testing/5-My Source/1-ISTQB Foundation Level/7-Test Levels, Test Types and Testing Quadrants.docx
@@ -107,7 +107,7 @@
     </w:p>
     <w:p>
       <w:r>
-        <w:pict w14:anchorId="5725B204">
+        <w:pict w14:anchorId="2AF1A16A">
           <v:rect id="_x0000_i1025" style="width:0;height:1.5pt" o:hralign="center" o:hrstd="t" o:hr="t" fillcolor="#a0a0a0" stroked="f"/>
         </w:pict>
       </w:r>
@@ -323,7 +323,7 @@
           <w:noProof/>
         </w:rPr>
         <w:drawing>
-          <wp:inline distT="114300" distB="114300" distL="114300" distR="114300" wp14:anchorId="0129C389" wp14:editId="3A3F2175">
+          <wp:inline distT="114300" distB="114300" distL="114300" distR="114300" wp14:anchorId="4D26ABEC" wp14:editId="5F9E48A3">
             <wp:extent cx="5943600" cy="2044700"/>
             <wp:effectExtent l="0" t="0" r="0" b="0"/>
             <wp:docPr id="4" name="image1.png"/>
@@ -1020,7 +1020,7 @@
     </w:tbl>
     <w:p>
       <w:r>
-        <w:pict w14:anchorId="5C2B344B">
+        <w:pict w14:anchorId="12CA1EFA">
           <v:rect id="_x0000_i1026" style="width:0;height:1.5pt" o:hralign="center" o:hrstd="t" o:hr="t" fillcolor="#a0a0a0" stroked="f"/>
         </w:pict>
       </w:r>
@@ -1568,7 +1568,7 @@
     </w:p>
     <w:p>
       <w:r>
-        <w:pict w14:anchorId="00821038">
+        <w:pict w14:anchorId="6F130A86">
           <v:rect id="_x0000_i1027" style="width:0;height:1.5pt" o:hralign="center" o:hrstd="t" o:hr="t" fillcolor="#a0a0a0" stroked="f"/>
         </w:pict>
       </w:r>
@@ -1700,7 +1700,7 @@
     </w:p>
     <w:p>
       <w:r>
-        <w:pict w14:anchorId="18B4E832">
+        <w:pict w14:anchorId="4887AF3D">
           <v:rect id="_x0000_i1028" style="width:0;height:1.5pt" o:hralign="center" o:hrstd="t" o:hr="t" fillcolor="#a0a0a0" stroked="f"/>
         </w:pict>
       </w:r>
@@ -1790,7 +1790,7 @@
         </w:rPr>
         <w:lastRenderedPageBreak/>
         <w:drawing>
-          <wp:inline distT="114300" distB="114300" distL="114300" distR="114300" wp14:anchorId="22F3524F" wp14:editId="6BA9669B">
+          <wp:inline distT="114300" distB="114300" distL="114300" distR="114300" wp14:anchorId="56556F21" wp14:editId="26951DA1">
             <wp:extent cx="5943600" cy="1879600"/>
             <wp:effectExtent l="0" t="0" r="0" b="0"/>
             <wp:docPr id="3" name="image3.png"/>
@@ -2346,7 +2346,7 @@
     </w:tbl>
     <w:p>
       <w:r>
-        <w:pict w14:anchorId="6F3C9450">
+        <w:pict w14:anchorId="185A9B0B">
           <v:rect id="_x0000_i1029" style="width:0;height:1.5pt" o:hralign="center" o:hrstd="t" o:hr="t" fillcolor="#a0a0a0" stroked="f"/>
         </w:pict>
       </w:r>
@@ -2927,7 +2927,7 @@
     </w:p>
     <w:p>
       <w:r>
-        <w:pict w14:anchorId="0212B7B7">
+        <w:pict w14:anchorId="66FAAD57">
           <v:rect id="_x0000_i1030" style="width:0;height:1.5pt" o:hralign="center" o:hrstd="t" o:hr="t" fillcolor="#a0a0a0" stroked="f"/>
         </w:pict>
       </w:r>
@@ -3150,7 +3150,7 @@
     </w:p>
     <w:p>
       <w:r>
-        <w:pict w14:anchorId="231E9FE7">
+        <w:pict w14:anchorId="39D8D339">
           <v:rect id="_x0000_i1031" style="width:0;height:1.5pt" o:hralign="center" o:hrstd="t" o:hr="t" fillcolor="#a0a0a0" stroked="f"/>
         </w:pict>
       </w:r>
@@ -3465,7 +3465,7 @@
     </w:p>
     <w:p>
       <w:r>
-        <w:pict w14:anchorId="68E93224">
+        <w:pict w14:anchorId="4E2C0BC5">
           <v:rect id="_x0000_i1032" style="width:0;height:1.5pt" o:hralign="center" o:hrstd="t" o:hr="t" fillcolor="#a0a0a0" stroked="f"/>
         </w:pict>
       </w:r>
@@ -3661,7 +3661,7 @@
     </w:p>
     <w:p>
       <w:r>
-        <w:pict w14:anchorId="55357C06">
+        <w:pict w14:anchorId="0ACC6B26">
           <v:rect id="_x0000_i1033" style="width:0;height:1.5pt" o:hralign="center" o:hrstd="t" o:hr="t" fillcolor="#a0a0a0" stroked="f"/>
         </w:pict>
       </w:r>
@@ -3856,7 +3856,7 @@
     </w:p>
     <w:p>
       <w:r>
-        <w:pict w14:anchorId="7FE3D010">
+        <w:pict w14:anchorId="5F373777">
           <v:rect id="_x0000_i1034" style="width:0;height:1.5pt" o:hralign="center" o:hrstd="t" o:hr="t" fillcolor="#a0a0a0" stroked="f"/>
         </w:pict>
       </w:r>
@@ -4035,7 +4035,7 @@
     </w:p>
     <w:p>
       <w:r>
-        <w:pict w14:anchorId="61B1E681">
+        <w:pict w14:anchorId="6457C5F1">
           <v:rect id="_x0000_i1035" style="width:0;height:1.5pt" o:hralign="center" o:hrstd="t" o:hr="t" fillcolor="#a0a0a0" stroked="f"/>
         </w:pict>
       </w:r>
@@ -4231,7 +4231,7 @@
     </w:p>
     <w:p>
       <w:r>
-        <w:pict w14:anchorId="00E4C3E6">
+        <w:pict w14:anchorId="1651961B">
           <v:rect id="_x0000_i1036" style="width:0;height:1.5pt" o:hralign="center" o:hrstd="t" o:hr="t" fillcolor="#a0a0a0" stroked="f"/>
         </w:pict>
       </w:r>
@@ -4373,7 +4373,7 @@
         <w:spacing w:before="480"/>
       </w:pPr>
       <w:r>
-        <w:pict w14:anchorId="633C0AA5">
+        <w:pict w14:anchorId="52F83E55">
           <v:rect id="_x0000_i1037" style="width:0;height:1.5pt" o:hralign="center" o:hrstd="t" o:hr="t" fillcolor="#a0a0a0" stroked="f"/>
         </w:pict>
       </w:r>
@@ -4643,7 +4643,7 @@
       </w:pPr>
       <w:r>
         <w:lastRenderedPageBreak/>
-        <w:pict w14:anchorId="11714FB6">
+        <w:pict w14:anchorId="187C2962">
           <v:rect id="_x0000_i1038" style="width:0;height:1.5pt" o:hralign="center" o:hrstd="t" o:hr="t" fillcolor="#a0a0a0" stroked="f"/>
         </w:pict>
       </w:r>
@@ -5048,7 +5048,7 @@
         </w:rPr>
         <w:lastRenderedPageBreak/>
         <w:drawing>
-          <wp:inline distT="114300" distB="114300" distL="114300" distR="114300" wp14:anchorId="5CD23434" wp14:editId="07299E50">
+          <wp:inline distT="114300" distB="114300" distL="114300" distR="114300" wp14:anchorId="419E7EC2" wp14:editId="7871A713">
             <wp:extent cx="5943600" cy="3962400"/>
             <wp:effectExtent l="0" t="0" r="0" b="0"/>
             <wp:docPr id="2" name="image4.png"/>
@@ -5089,7 +5089,7 @@
         <w:spacing w:before="480"/>
       </w:pPr>
       <w:r>
-        <w:pict w14:anchorId="430BAA0C">
+        <w:pict w14:anchorId="6E4C5AA8">
           <v:rect id="_x0000_i1039" style="width:0;height:1.5pt" o:hralign="center" o:hrstd="t" o:hr="t" fillcolor="#a0a0a0" stroked="f"/>
         </w:pict>
       </w:r>
@@ -5244,7 +5244,7 @@
         <w:spacing w:before="480"/>
       </w:pPr>
       <w:r>
-        <w:pict w14:anchorId="3187594A">
+        <w:pict w14:anchorId="023ED8DE">
           <v:rect id="_x0000_i1040" style="width:0;height:1.5pt" o:hralign="center" o:hrstd="t" o:hr="t" fillcolor="#a0a0a0" stroked="f"/>
         </w:pict>
       </w:r>
@@ -5322,7 +5322,7 @@
           <w:noProof/>
         </w:rPr>
         <w:drawing>
-          <wp:inline distT="114300" distB="114300" distL="114300" distR="114300" wp14:anchorId="62AB1A5C" wp14:editId="591F1735">
+          <wp:inline distT="114300" distB="114300" distL="114300" distR="114300" wp14:anchorId="3B23727F" wp14:editId="59EC4FDF">
             <wp:extent cx="5943600" cy="2235200"/>
             <wp:effectExtent l="0" t="0" r="0" b="0"/>
             <wp:docPr id="1" name="image2.png"/>
@@ -5478,7 +5478,7 @@
     <w:p/>
     <w:p>
       <w:r>
-        <w:pict w14:anchorId="307937F0">
+        <w:pict w14:anchorId="40127D9D">
           <v:rect id="_x0000_i1041" style="width:0;height:1.5pt" o:hralign="center" o:hrstd="t" o:hr="t" fillcolor="#a0a0a0" stroked="f"/>
         </w:pict>
       </w:r>
@@ -5622,11 +5622,12 @@
     </w:p>
     <w:p>
       <w:r>
-        <w:pict w14:anchorId="3563B3AD">
+        <w:pict w14:anchorId="2069B606">
           <v:rect id="_x0000_i1042" style="width:0;height:1.5pt" o:hralign="center" o:hrstd="t" o:hr="t" fillcolor="#a0a0a0" stroked="f"/>
         </w:pict>
       </w:r>
     </w:p>
+    <w:p/>
     <w:p/>
     <w:p/>
     <w:p/>
@@ -7439,7 +7440,7 @@
   <w:style w:type="paragraph" w:default="1" w:styleId="Normal">
     <w:name w:val="Normal"/>
     <w:qFormat/>
-    <w:rsid w:val="009B7DA7"/>
+    <w:rsid w:val="00D904B9"/>
     <w:pPr>
       <w:spacing w:after="0" w:line="276" w:lineRule="auto"/>
     </w:pPr>
@@ -7459,7 +7460,7 @@
     <w:link w:val="Heading1Char"/>
     <w:uiPriority w:val="9"/>
     <w:qFormat/>
-    <w:rsid w:val="00D37D9E"/>
+    <w:rsid w:val="00E16AF2"/>
     <w:pPr>
       <w:keepNext/>
       <w:keepLines/>
@@ -7481,7 +7482,7 @@
     <w:uiPriority w:val="9"/>
     <w:unhideWhenUsed/>
     <w:qFormat/>
-    <w:rsid w:val="00D37D9E"/>
+    <w:rsid w:val="00E16AF2"/>
     <w:pPr>
       <w:keepNext/>
       <w:keepLines/>
@@ -7503,7 +7504,7 @@
     <w:uiPriority w:val="9"/>
     <w:unhideWhenUsed/>
     <w:qFormat/>
-    <w:rsid w:val="00D37D9E"/>
+    <w:rsid w:val="00E16AF2"/>
     <w:pPr>
       <w:keepNext/>
       <w:keepLines/>
@@ -7525,7 +7526,7 @@
     <w:uiPriority w:val="9"/>
     <w:unhideWhenUsed/>
     <w:qFormat/>
-    <w:rsid w:val="00D37D9E"/>
+    <w:rsid w:val="00E16AF2"/>
     <w:pPr>
       <w:keepNext/>
       <w:keepLines/>
@@ -7548,7 +7549,7 @@
     <w:semiHidden/>
     <w:unhideWhenUsed/>
     <w:qFormat/>
-    <w:rsid w:val="00D37D9E"/>
+    <w:rsid w:val="00E16AF2"/>
     <w:pPr>
       <w:keepNext/>
       <w:keepLines/>
@@ -7569,7 +7570,7 @@
     <w:semiHidden/>
     <w:unhideWhenUsed/>
     <w:qFormat/>
-    <w:rsid w:val="00D37D9E"/>
+    <w:rsid w:val="00E16AF2"/>
     <w:pPr>
       <w:keepNext/>
       <w:keepLines/>
@@ -7592,7 +7593,7 @@
     <w:semiHidden/>
     <w:unhideWhenUsed/>
     <w:qFormat/>
-    <w:rsid w:val="00D37D9E"/>
+    <w:rsid w:val="00E16AF2"/>
     <w:pPr>
       <w:keepNext/>
       <w:keepLines/>
@@ -7613,7 +7614,7 @@
     <w:semiHidden/>
     <w:unhideWhenUsed/>
     <w:qFormat/>
-    <w:rsid w:val="00D37D9E"/>
+    <w:rsid w:val="00E16AF2"/>
     <w:pPr>
       <w:keepNext/>
       <w:keepLines/>
@@ -7635,7 +7636,7 @@
     <w:semiHidden/>
     <w:unhideWhenUsed/>
     <w:qFormat/>
-    <w:rsid w:val="00D37D9E"/>
+    <w:rsid w:val="00E16AF2"/>
     <w:pPr>
       <w:keepNext/>
       <w:keepLines/>
@@ -7678,7 +7679,7 @@
     <w:basedOn w:val="DefaultParagraphFont"/>
     <w:link w:val="Heading1"/>
     <w:uiPriority w:val="9"/>
-    <w:rsid w:val="00D37D9E"/>
+    <w:rsid w:val="00E16AF2"/>
     <w:rPr>
       <w:rFonts w:asciiTheme="majorHAnsi" w:eastAsiaTheme="majorEastAsia" w:hAnsiTheme="majorHAnsi" w:cstheme="majorBidi"/>
       <w:color w:val="2F5496" w:themeColor="accent1" w:themeShade="BF"/>
@@ -7691,7 +7692,7 @@
     <w:basedOn w:val="DefaultParagraphFont"/>
     <w:link w:val="Heading2"/>
     <w:uiPriority w:val="9"/>
-    <w:rsid w:val="00D37D9E"/>
+    <w:rsid w:val="00E16AF2"/>
     <w:rPr>
       <w:rFonts w:asciiTheme="majorHAnsi" w:eastAsiaTheme="majorEastAsia" w:hAnsiTheme="majorHAnsi" w:cstheme="majorBidi"/>
       <w:color w:val="2F5496" w:themeColor="accent1" w:themeShade="BF"/>
@@ -7704,7 +7705,7 @@
     <w:basedOn w:val="DefaultParagraphFont"/>
     <w:link w:val="Heading3"/>
     <w:uiPriority w:val="9"/>
-    <w:rsid w:val="00D37D9E"/>
+    <w:rsid w:val="00E16AF2"/>
     <w:rPr>
       <w:rFonts w:eastAsiaTheme="majorEastAsia" w:cstheme="majorBidi"/>
       <w:color w:val="2F5496" w:themeColor="accent1" w:themeShade="BF"/>
@@ -7717,7 +7718,7 @@
     <w:basedOn w:val="DefaultParagraphFont"/>
     <w:link w:val="Heading4"/>
     <w:uiPriority w:val="9"/>
-    <w:rsid w:val="00D37D9E"/>
+    <w:rsid w:val="00E16AF2"/>
     <w:rPr>
       <w:rFonts w:eastAsiaTheme="majorEastAsia" w:cstheme="majorBidi"/>
       <w:i/>
@@ -7731,7 +7732,7 @@
     <w:link w:val="Heading5"/>
     <w:uiPriority w:val="9"/>
     <w:semiHidden/>
-    <w:rsid w:val="00D37D9E"/>
+    <w:rsid w:val="00E16AF2"/>
     <w:rPr>
       <w:rFonts w:eastAsiaTheme="majorEastAsia" w:cstheme="majorBidi"/>
       <w:color w:val="2F5496" w:themeColor="accent1" w:themeShade="BF"/>
@@ -7743,7 +7744,7 @@
     <w:link w:val="Heading6"/>
     <w:uiPriority w:val="9"/>
     <w:semiHidden/>
-    <w:rsid w:val="00D37D9E"/>
+    <w:rsid w:val="00E16AF2"/>
     <w:rPr>
       <w:rFonts w:eastAsiaTheme="majorEastAsia" w:cstheme="majorBidi"/>
       <w:i/>
@@ -7757,7 +7758,7 @@
     <w:link w:val="Heading7"/>
     <w:uiPriority w:val="9"/>
     <w:semiHidden/>
-    <w:rsid w:val="00D37D9E"/>
+    <w:rsid w:val="00E16AF2"/>
     <w:rPr>
       <w:rFonts w:eastAsiaTheme="majorEastAsia" w:cstheme="majorBidi"/>
       <w:color w:val="595959" w:themeColor="text1" w:themeTint="A6"/>
@@ -7769,7 +7770,7 @@
     <w:link w:val="Heading8"/>
     <w:uiPriority w:val="9"/>
     <w:semiHidden/>
-    <w:rsid w:val="00D37D9E"/>
+    <w:rsid w:val="00E16AF2"/>
     <w:rPr>
       <w:rFonts w:eastAsiaTheme="majorEastAsia" w:cstheme="majorBidi"/>
       <w:i/>
@@ -7783,7 +7784,7 @@
     <w:link w:val="Heading9"/>
     <w:uiPriority w:val="9"/>
     <w:semiHidden/>
-    <w:rsid w:val="00D37D9E"/>
+    <w:rsid w:val="00E16AF2"/>
     <w:rPr>
       <w:rFonts w:eastAsiaTheme="majorEastAsia" w:cstheme="majorBidi"/>
       <w:color w:val="272727" w:themeColor="text1" w:themeTint="D8"/>
@@ -7796,7 +7797,7 @@
     <w:link w:val="TitleChar"/>
     <w:uiPriority w:val="10"/>
     <w:qFormat/>
-    <w:rsid w:val="00D37D9E"/>
+    <w:rsid w:val="00E16AF2"/>
     <w:pPr>
       <w:spacing w:after="80" w:line="240" w:lineRule="auto"/>
       <w:contextualSpacing/>
@@ -7814,7 +7815,7 @@
     <w:basedOn w:val="DefaultParagraphFont"/>
     <w:link w:val="Title"/>
     <w:uiPriority w:val="10"/>
-    <w:rsid w:val="00D37D9E"/>
+    <w:rsid w:val="00E16AF2"/>
     <w:rPr>
       <w:rFonts w:asciiTheme="majorHAnsi" w:eastAsiaTheme="majorEastAsia" w:hAnsiTheme="majorHAnsi" w:cstheme="majorBidi"/>
       <w:spacing w:val="-10"/>
@@ -7830,7 +7831,7 @@
     <w:link w:val="SubtitleChar"/>
     <w:uiPriority w:val="11"/>
     <w:qFormat/>
-    <w:rsid w:val="00D37D9E"/>
+    <w:rsid w:val="00E16AF2"/>
     <w:pPr>
       <w:numPr>
         <w:ilvl w:val="1"/>
@@ -7849,7 +7850,7 @@
     <w:basedOn w:val="DefaultParagraphFont"/>
     <w:link w:val="Subtitle"/>
     <w:uiPriority w:val="11"/>
-    <w:rsid w:val="00D37D9E"/>
+    <w:rsid w:val="00E16AF2"/>
     <w:rPr>
       <w:rFonts w:eastAsiaTheme="majorEastAsia" w:cstheme="majorBidi"/>
       <w:color w:val="595959" w:themeColor="text1" w:themeTint="A6"/>
@@ -7865,7 +7866,7 @@
     <w:link w:val="QuoteChar"/>
     <w:uiPriority w:val="29"/>
     <w:qFormat/>
-    <w:rsid w:val="00D37D9E"/>
+    <w:rsid w:val="00E16AF2"/>
     <w:pPr>
       <w:spacing w:before="160"/>
       <w:jc w:val="center"/>
@@ -7881,7 +7882,7 @@
     <w:basedOn w:val="DefaultParagraphFont"/>
     <w:link w:val="Quote"/>
     <w:uiPriority w:val="29"/>
-    <w:rsid w:val="00D37D9E"/>
+    <w:rsid w:val="00E16AF2"/>
     <w:rPr>
       <w:i/>
       <w:iCs/>
@@ -7893,7 +7894,7 @@
     <w:basedOn w:val="Normal"/>
     <w:uiPriority w:val="34"/>
     <w:qFormat/>
-    <w:rsid w:val="00D37D9E"/>
+    <w:rsid w:val="00E16AF2"/>
     <w:pPr>
       <w:ind w:left="720"/>
       <w:contextualSpacing/>
@@ -7904,7 +7905,7 @@
     <w:basedOn w:val="DefaultParagraphFont"/>
     <w:uiPriority w:val="21"/>
     <w:qFormat/>
-    <w:rsid w:val="00D37D9E"/>
+    <w:rsid w:val="00E16AF2"/>
     <w:rPr>
       <w:i/>
       <w:iCs/>
@@ -7918,7 +7919,7 @@
     <w:link w:val="IntenseQuoteChar"/>
     <w:uiPriority w:val="30"/>
     <w:qFormat/>
-    <w:rsid w:val="00D37D9E"/>
+    <w:rsid w:val="00E16AF2"/>
     <w:pPr>
       <w:pBdr>
         <w:top w:val="single" w:sz="4" w:space="10" w:color="2F5496" w:themeColor="accent1" w:themeShade="BF"/>
@@ -7939,7 +7940,7 @@
     <w:basedOn w:val="DefaultParagraphFont"/>
     <w:link w:val="IntenseQuote"/>
     <w:uiPriority w:val="30"/>
-    <w:rsid w:val="00D37D9E"/>
+    <w:rsid w:val="00E16AF2"/>
     <w:rPr>
       <w:i/>
       <w:iCs/>
@@ -7951,7 +7952,7 @@
     <w:basedOn w:val="DefaultParagraphFont"/>
     <w:uiPriority w:val="32"/>
     <w:qFormat/>
-    <w:rsid w:val="00D37D9E"/>
+    <w:rsid w:val="00E16AF2"/>
     <w:rPr>
       <w:b/>
       <w:bCs/>

</xml_diff>